<commit_message>
Republish dashboard updates: new screenshots, revised Q2/Q4 findings, one-pager, docx build script
- Refresh all 7 dashboard screenshots from the republished live dashboard
- Update README headline-finding table and research_questions.md for the
  revised Q2 activity-mix percentages and the new Q4 survival-rate stat
- Split Q5's correlation KPI into two plain-language cards and correct the
  engagement-metric caveat wording
- Verify FY24-25's engagement figure against its source PDF
- Add the one-page portfolio summary PDF, linked from the README
- Commit the docx build script to docs/build/, matching what the README
  already described, and fix a numbering bug in it

Co-Authored-By: Claude Sonnet 5 <noreply@anthropic.com>
</commit_message>
<xml_diff>
--- a/docs/research_questions.docx
+++ b/docs/research_questions.docx
@@ -28,88 +28,74 @@
         <w:rPr>
           <w:rFonts w:ascii="Calibri" w:cs="Calibri" w:eastAsia="Calibri" w:hAnsi="Calibri"/>
         </w:rPr>
-        <w:t xml:space="preserve">This is the working definition of what this dashboard is trying to answer. Every report page should trace back to one of these five questions. When a visual doesn't obviously serve one of them, that's a signal to cut it or fold it into one that does — discipline matters more here than volume of charts.</w:t>
-      </w:r>
-    </w:p>
-    <w:p>
-      <w:pPr>
-        <w:spacing w:after="160"/>
-      </w:pPr>
-      <w:r>
-        <w:rPr>
-          <w:rFonts w:ascii="Calibri" w:cs="Calibri" w:eastAsia="Calibri" w:hAnsi="Calibri"/>
-        </w:rPr>
-        <w:t xml:space="preserve">One page — Data Quality and Methodology — is deliberately not one of the five numbered questions below. Its job is to qualify all five, not answer one of them, so it lives as an appendix at the end of this document instead of taking a Q-number.</w:t>
-      </w:r>
-    </w:p>
-    <w:p>
-      <w:pPr>
-        <w:spacing w:after="240"/>
-      </w:pPr>
-      <w:r>
-        <w:rPr>
-          <w:rFonts w:ascii="Calibri" w:cs="Calibri" w:eastAsia="Calibri" w:hAnsi="Calibri"/>
-          <w:b/>
-          <w:bCs/>
-          <w:i/>
-          <w:iCs/>
-        </w:rPr>
-        <w:t xml:space="preserve">Source data: </w:t>
-      </w:r>
-      <w:r>
-        <w:rPr>
-          <w:rFonts w:ascii="Calibri" w:cs="Calibri" w:eastAsia="Calibri" w:hAnsi="Calibri"/>
-          <w:i/>
-          <w:iCs/>
-        </w:rPr>
-        <w:t xml:space="preserve">CAIC accident database, 1,016 fatal events, 1951-2025 (see </w:t>
-      </w:r>
-      <w:r>
-        <w:rPr>
-          <w:rFonts w:ascii="Consolas" w:cs="Consolas" w:eastAsia="Consolas" w:hAnsi="Consolas"/>
-          <w:i/>
-          <w:iCs/>
-          <w:sz w:val="20"/>
-          <w:szCs w:val="20"/>
-          <w:shd w:fill="F0F0F0"/>
+        <w:t xml:space="preserve">This is the working definition of what this dashboard is trying to answer. Every report page should trace back to one of these five questions. When a visual doesn't obviously serve one of them, that's a signal to cut it or fold it into one that does discipline matters more here than volume of charts.</w:t>
+      </w:r>
+    </w:p>
+    <w:p>
+      <w:pPr>
+        <w:spacing w:after="160"/>
+      </w:pPr>
+      <w:r>
+        <w:rPr>
+          <w:rFonts w:ascii="Calibri" w:cs="Calibri" w:eastAsia="Calibri" w:hAnsi="Calibri"/>
+        </w:rPr>
+        <w:t xml:space="preserve">Source data: CAIC accident database, 1,016 fatal events, 1951-2025 (see </w:t>
+      </w:r>
+      <w:r>
+        <w:rPr>
+          <w:rFonts w:ascii="Consolas" w:cs="Consolas" w:eastAsia="Consolas" w:hAnsi="Consolas"/>
+          <w:sz w:val="20"/>
+          <w:szCs w:val="20"/>
+          <w:shd w:fill="F0F0F0" w:val="clear"/>
         </w:rPr>
         <w:t xml:space="preserve">fact_table_data_dictionary.md</w:t>
       </w:r>
       <w:r>
         <w:rPr>
           <w:rFonts w:ascii="Calibri" w:cs="Calibri" w:eastAsia="Calibri" w:hAnsi="Calibri"/>
-          <w:i/>
-          <w:iCs/>
         </w:rPr>
         <w:t xml:space="preserve">), and the hand-assembled CAIC engagement proxy, FY2015-16 through FY2024-25 (see </w:t>
       </w:r>
       <w:r>
         <w:rPr>
           <w:rFonts w:ascii="Consolas" w:cs="Consolas" w:eastAsia="Consolas" w:hAnsi="Consolas"/>
-          <w:i/>
-          <w:iCs/>
-          <w:sz w:val="20"/>
-          <w:szCs w:val="20"/>
-          <w:shd w:fill="F0F0F0"/>
+          <w:sz w:val="20"/>
+          <w:szCs w:val="20"/>
+          <w:shd w:fill="F0F0F0" w:val="clear"/>
         </w:rPr>
         <w:t xml:space="preserve">caic_engagement_data_dictionary.md</w:t>
       </w:r>
       <w:r>
         <w:rPr>
           <w:rFonts w:ascii="Calibri" w:cs="Calibri" w:eastAsia="Calibri" w:hAnsi="Calibri"/>
-          <w:i/>
-          <w:iCs/>
         </w:rPr>
         <w:t xml:space="preserve">).</w:t>
       </w:r>
     </w:p>
     <w:p>
       <w:pPr>
-        <w:pBdr>
-          <w:bottom w:val="single" w:color="AAAAAA" w:sz="6" w:space="1"/>
-        </w:pBdr>
-        <w:spacing w:after="240" w:before="120"/>
-      </w:pPr>
+        <w:spacing w:after="160"/>
+      </w:pPr>
+      <w:r>
+        <w:rPr>
+          <w:rFonts w:ascii="Calibri" w:cs="Calibri" w:eastAsia="Calibri" w:hAnsi="Calibri"/>
+        </w:rPr>
+        <w:t xml:space="preserve">One page — </w:t>
+      </w:r>
+      <w:r>
+        <w:rPr>
+          <w:rFonts w:ascii="Calibri" w:cs="Calibri" w:eastAsia="Calibri" w:hAnsi="Calibri"/>
+          <w:b/>
+          <w:bCs/>
+        </w:rPr>
+        <w:t xml:space="preserve">Data Quality and Methodology</w:t>
+      </w:r>
+      <w:r>
+        <w:rPr>
+          <w:rFonts w:ascii="Calibri" w:cs="Calibri" w:eastAsia="Calibri" w:hAnsi="Calibri"/>
+        </w:rPr>
+        <w:t xml:space="preserve"> — is deliberately not one of the five numbered questions below. Its job is to qualify all five, not answer one of them, so it lives as an appendix at the end of this document instead of taking a Q-number.</w:t>
+      </w:r>
     </w:p>
     <w:p>
       <w:pPr>
@@ -130,52 +116,58 @@
           <w:b/>
           <w:bCs/>
         </w:rPr>
-        <w:t xml:space="preserve">Question: </w:t>
-      </w:r>
-      <w:r>
-        <w:rPr>
-          <w:rFonts w:ascii="Calibri" w:cs="Calibri" w:eastAsia="Calibri" w:hAnsi="Calibri"/>
-        </w:rPr>
-        <w:t xml:space="preserve">How have avalanche fatalities changed nationally over the last 75 seasons?</w:t>
-      </w:r>
-    </w:p>
-    <w:p>
-      <w:pPr>
-        <w:spacing w:after="160"/>
-      </w:pPr>
-      <w:r>
-        <w:rPr>
-          <w:rFonts w:ascii="Calibri" w:cs="Calibri" w:eastAsia="Calibri" w:hAnsi="Calibri"/>
-          <w:b/>
-          <w:bCs/>
-        </w:rPr>
-        <w:t xml:space="preserve">Why it matters: </w:t>
-      </w:r>
-      <w:r>
-        <w:rPr>
-          <w:rFonts w:ascii="Calibri" w:cs="Calibri" w:eastAsia="Calibri" w:hAnsi="Calibri"/>
-        </w:rPr>
-        <w:t xml:space="preserve">A rising death count on its own is ambiguous — it could mean the activity is getting more dangerous, or it could just mean more people are doing it. Tremper's core argument is that avalanche risk is mostly a human-factors problem, not a snowpack problem; a naive “deaths are up” headline without an exposure denominator plays directly into the wrong conclusion. This page can only show the raw national trend — the actual exposure-denominator comparison, using CAIC's own engagement data as a Colorado-specific proxy, lives entirely on Q5.</w:t>
-      </w:r>
-    </w:p>
-    <w:p>
-      <w:pPr>
-        <w:spacing w:after="160"/>
-      </w:pPr>
-      <w:r>
-        <w:rPr>
-          <w:rFonts w:ascii="Calibri" w:cs="Calibri" w:eastAsia="Calibri" w:hAnsi="Calibri"/>
-          <w:b/>
-          <w:bCs/>
-        </w:rPr>
-        <w:t xml:space="preserve">Supports it: </w:t>
-      </w:r>
-      <w:r>
-        <w:rPr>
-          <w:rFonts w:ascii="Consolas" w:cs="Consolas" w:eastAsia="Consolas" w:hAnsi="Consolas"/>
-          <w:sz w:val="20"/>
-          <w:szCs w:val="20"/>
-          <w:shd w:fill="F0F0F0"/>
+        <w:t xml:space="preserve">Question:</w:t>
+      </w:r>
+      <w:r>
+        <w:rPr>
+          <w:rFonts w:ascii="Calibri" w:cs="Calibri" w:eastAsia="Calibri" w:hAnsi="Calibri"/>
+        </w:rPr>
+        <w:t xml:space="preserve"> How have avalanche fatalities changed nationally over the last 75 seasons?</w:t>
+      </w:r>
+    </w:p>
+    <w:p>
+      <w:pPr>
+        <w:spacing w:after="160"/>
+      </w:pPr>
+      <w:r>
+        <w:rPr>
+          <w:rFonts w:ascii="Calibri" w:cs="Calibri" w:eastAsia="Calibri" w:hAnsi="Calibri"/>
+          <w:b/>
+          <w:bCs/>
+        </w:rPr>
+        <w:t xml:space="preserve">Why it matters:</w:t>
+      </w:r>
+      <w:r>
+        <w:rPr>
+          <w:rFonts w:ascii="Calibri" w:cs="Calibri" w:eastAsia="Calibri" w:hAnsi="Calibri"/>
+        </w:rPr>
+        <w:t xml:space="preserve"> A rising death count on its own is ambiguous — it could mean the activity is getting more dangerous, or it could just mean more people are doing it. Tremper's core argument is that avalanche risk is mostly a human-factors problem, not a snowpack problem; a naive "deaths are up" headline without an exposure denominator plays directly into the wrong conclusion. This page can only show the raw national trend — the actual exposure-denominator comparison, using CAIC's own engagement data as a Colorado-specific proxy, lives entirely on Q5.</w:t>
+      </w:r>
+    </w:p>
+    <w:p>
+      <w:pPr>
+        <w:spacing w:after="160"/>
+      </w:pPr>
+      <w:r>
+        <w:rPr>
+          <w:rFonts w:ascii="Calibri" w:cs="Calibri" w:eastAsia="Calibri" w:hAnsi="Calibri"/>
+          <w:b/>
+          <w:bCs/>
+        </w:rPr>
+        <w:t xml:space="preserve">Supports it:</w:t>
+      </w:r>
+      <w:r>
+        <w:rPr>
+          <w:rFonts w:ascii="Calibri" w:cs="Calibri" w:eastAsia="Calibri" w:hAnsi="Calibri"/>
+        </w:rPr>
+        <w:t xml:space="preserve"> </w:t>
+      </w:r>
+      <w:r>
+        <w:rPr>
+          <w:rFonts w:ascii="Consolas" w:cs="Consolas" w:eastAsia="Consolas" w:hAnsi="Consolas"/>
+          <w:sz w:val="20"/>
+          <w:szCs w:val="20"/>
+          <w:shd w:fill="F0F0F0" w:val="clear"/>
         </w:rPr>
         <w:t xml:space="preserve">Total Fatalities</w:t>
       </w:r>
@@ -190,7 +182,7 @@
           <w:rFonts w:ascii="Consolas" w:cs="Consolas" w:eastAsia="Consolas" w:hAnsi="Consolas"/>
           <w:sz w:val="20"/>
           <w:szCs w:val="20"/>
-          <w:shd w:fill="F0F0F0"/>
+          <w:shd w:fill="F0F0F0" w:val="clear"/>
         </w:rPr>
         <w:t xml:space="preserve">Fatalities 5yr Avg</w:t>
       </w:r>
@@ -205,7 +197,7 @@
           <w:rFonts w:ascii="Consolas" w:cs="Consolas" w:eastAsia="Consolas" w:hAnsi="Consolas"/>
           <w:sz w:val="20"/>
           <w:szCs w:val="20"/>
-          <w:shd w:fill="F0F0F0"/>
+          <w:shd w:fill="F0F0F0" w:val="clear"/>
         </w:rPr>
         <w:t xml:space="preserve">Avg Fatalities Per Season</w:t>
       </w:r>
@@ -220,7 +212,7 @@
           <w:rFonts w:ascii="Consolas" w:cs="Consolas" w:eastAsia="Consolas" w:hAnsi="Consolas"/>
           <w:sz w:val="20"/>
           <w:szCs w:val="20"/>
-          <w:shd w:fill="F0F0F0"/>
+          <w:shd w:fill="F0F0F0" w:val="clear"/>
         </w:rPr>
         <w:t xml:space="preserve">Deadliest Season Fatalities</w:t>
       </w:r>
@@ -235,7 +227,7 @@
           <w:rFonts w:ascii="Consolas" w:cs="Consolas" w:eastAsia="Consolas" w:hAnsi="Consolas"/>
           <w:sz w:val="20"/>
           <w:szCs w:val="20"/>
-          <w:shd w:fill="F0F0F0"/>
+          <w:shd w:fill="F0F0F0" w:val="clear"/>
         </w:rPr>
         <w:t xml:space="preserve">Label</w:t>
       </w:r>
@@ -250,7 +242,7 @@
           <w:rFonts w:ascii="Consolas" w:cs="Consolas" w:eastAsia="Consolas" w:hAnsi="Consolas"/>
           <w:sz w:val="20"/>
           <w:szCs w:val="20"/>
-          <w:shd w:fill="F0F0F0"/>
+          <w:shd w:fill="F0F0F0" w:val="clear"/>
         </w:rPr>
         <w:t xml:space="preserve">Decade</w:t>
       </w:r>
@@ -271,20 +263,20 @@
           <w:b/>
           <w:bCs/>
         </w:rPr>
-        <w:t xml:space="preserve">Status: Done. </w:t>
-      </w:r>
-      <w:r>
-        <w:rPr>
-          <w:rFonts w:ascii="Calibri" w:cs="Calibri" w:eastAsia="Calibri" w:hAnsi="Calibri"/>
-        </w:rPr>
-        <w:t xml:space="preserve">Built as a single national-trend page (</w:t>
-      </w:r>
-      <w:r>
-        <w:rPr>
-          <w:rFonts w:ascii="Consolas" w:cs="Consolas" w:eastAsia="Consolas" w:hAnsi="Consolas"/>
-          <w:sz w:val="20"/>
-          <w:szCs w:val="20"/>
-          <w:shd w:fill="F0F0F0"/>
+        <w:t xml:space="preserve">Status: Done.</w:t>
+      </w:r>
+      <w:r>
+        <w:rPr>
+          <w:rFonts w:ascii="Calibri" w:cs="Calibri" w:eastAsia="Calibri" w:hAnsi="Calibri"/>
+        </w:rPr>
+        <w:t xml:space="preserve"> Built as a single national-trend page (</w:t>
+      </w:r>
+      <w:r>
+        <w:rPr>
+          <w:rFonts w:ascii="Consolas" w:cs="Consolas" w:eastAsia="Consolas" w:hAnsi="Consolas"/>
+          <w:sz w:val="20"/>
+          <w:szCs w:val="20"/>
+          <w:shd w:fill="F0F0F0" w:val="clear"/>
         </w:rPr>
         <w:t xml:space="preserve">Q1</w:t>
       </w:r>
@@ -299,7 +291,7 @@
           <w:rFonts w:ascii="Consolas" w:cs="Consolas" w:eastAsia="Consolas" w:hAnsi="Consolas"/>
           <w:sz w:val="20"/>
           <w:szCs w:val="20"/>
-          <w:shd w:fill="F0F0F0"/>
+          <w:shd w:fill="F0F0F0" w:val="clear"/>
         </w:rPr>
         <w:t xml:space="preserve">Total Fatalities</w:t>
       </w:r>
@@ -314,7 +306,7 @@
           <w:rFonts w:ascii="Consolas" w:cs="Consolas" w:eastAsia="Consolas" w:hAnsi="Consolas"/>
           <w:sz w:val="20"/>
           <w:szCs w:val="20"/>
-          <w:shd w:fill="F0F0F0"/>
+          <w:shd w:fill="F0F0F0" w:val="clear"/>
         </w:rPr>
         <w:t xml:space="preserve">Decade</w:t>
       </w:r>
@@ -329,7 +321,7 @@
           <w:rFonts w:ascii="Consolas" w:cs="Consolas" w:eastAsia="Consolas" w:hAnsi="Consolas"/>
           <w:sz w:val="20"/>
           <w:szCs w:val="20"/>
-          <w:shd w:fill="F0F0F0"/>
+          <w:shd w:fill="F0F0F0" w:val="clear"/>
         </w:rPr>
         <w:t xml:space="preserve">Avg Fatalities Per Season</w:t>
       </w:r>
@@ -344,7 +336,7 @@
           <w:rFonts w:ascii="Consolas" w:cs="Consolas" w:eastAsia="Consolas" w:hAnsi="Consolas"/>
           <w:sz w:val="20"/>
           <w:szCs w:val="20"/>
-          <w:shd w:fill="F0F0F0"/>
+          <w:shd w:fill="F0F0F0" w:val="clear"/>
         </w:rPr>
         <w:t xml:space="preserve">Deadliest Season Label</w:t>
       </w:r>
@@ -359,7 +351,7 @@
           <w:rFonts w:ascii="Consolas" w:cs="Consolas" w:eastAsia="Consolas" w:hAnsi="Consolas"/>
           <w:sz w:val="20"/>
           <w:szCs w:val="20"/>
-          <w:shd w:fill="F0F0F0"/>
+          <w:shd w:fill="F0F0F0" w:val="clear"/>
         </w:rPr>
         <w:t xml:space="preserve">Fatalities</w:t>
       </w:r>
@@ -374,7 +366,7 @@
           <w:rFonts w:ascii="Consolas" w:cs="Consolas" w:eastAsia="Consolas" w:hAnsi="Consolas"/>
           <w:sz w:val="20"/>
           <w:szCs w:val="20"/>
-          <w:shd w:fill="F0F0F0"/>
+          <w:shd w:fill="F0F0F0" w:val="clear"/>
         </w:rPr>
         <w:t xml:space="preserve">Total Fatalities</w:t>
       </w:r>
@@ -389,7 +381,7 @@
           <w:rFonts w:ascii="Consolas" w:cs="Consolas" w:eastAsia="Consolas" w:hAnsi="Consolas"/>
           <w:sz w:val="20"/>
           <w:szCs w:val="20"/>
-          <w:shd w:fill="F0F0F0"/>
+          <w:shd w:fill="F0F0F0" w:val="clear"/>
         </w:rPr>
         <w:t xml:space="preserve">Fatalities 5yr Avg</w:t>
       </w:r>
@@ -404,7 +396,7 @@
           <w:rFonts w:ascii="Consolas" w:cs="Consolas" w:eastAsia="Consolas" w:hAnsi="Consolas"/>
           <w:sz w:val="20"/>
           <w:szCs w:val="20"/>
-          <w:shd w:fill="F0F0F0"/>
+          <w:shd w:fill="F0F0F0" w:val="clear"/>
         </w:rPr>
         <w:t xml:space="preserve">SeasonLabel</w:t>
       </w:r>
@@ -419,7 +411,7 @@
           <w:rFonts w:ascii="Consolas" w:cs="Consolas" w:eastAsia="Consolas" w:hAnsi="Consolas"/>
           <w:sz w:val="20"/>
           <w:szCs w:val="20"/>
-          <w:shd w:fill="F0F0F0"/>
+          <w:shd w:fill="F0F0F0" w:val="clear"/>
         </w:rPr>
         <w:t xml:space="preserve">Killed</w:t>
       </w:r>
@@ -427,33 +419,33 @@
         <w:rPr>
           <w:rFonts w:ascii="Calibri" w:cs="Calibri" w:eastAsia="Calibri" w:hAnsi="Calibri"/>
         </w:rPr>
-        <w:t xml:space="preserve"> sums by decade): (1) the headline trend — fatalities rose sharply from the 1950s through the 1990s (about 4 to 22 per season, a 5x increase), then flattened; the three most recent decades all sit in a narrow 24-28-per-season band rather than continuing to climb, and the modern era (2000s-2020s) still averages roughly 3.6x the earliest three decades (1950s-1970s), almost entirely from pre-2000 growth; (2) the COVID-era 2020-21 season is the deadliest on record (37 fatalities, more than double the historical average), plausibly driven by a surge of inexperienced backcountry users during the pandemic — a Q2 (human-factors) story surfacing on the Q1 page (see “How these connect”).</w:t>
-      </w:r>
-    </w:p>
-    <w:p>
-      <w:pPr>
-        <w:spacing w:after="160"/>
-      </w:pPr>
-      <w:r>
-        <w:rPr>
-          <w:rFonts w:ascii="Calibri" w:cs="Calibri" w:eastAsia="Calibri" w:hAnsi="Calibri"/>
-          <w:b/>
-          <w:bCs/>
-        </w:rPr>
-        <w:t xml:space="preserve">Scoping decision: </w:t>
-      </w:r>
-      <w:r>
-        <w:rPr>
-          <w:rFonts w:ascii="Calibri" w:cs="Calibri" w:eastAsia="Calibri" w:hAnsi="Calibri"/>
-        </w:rPr>
-        <w:t xml:space="preserve">Colorado was originally meant to get its own spotlight on this page — comparing Colorado fatalities against CAIC's website-engagement data as an exposure proxy, hence the page's original “National trend, with a Colorado spotlight” framing. Two things changed that: (1) the chart didn't fit on Page 1, so it got built as a second tab (</w:t>
-      </w:r>
-      <w:r>
-        <w:rPr>
-          <w:rFonts w:ascii="Consolas" w:cs="Consolas" w:eastAsia="Consolas" w:hAnsi="Consolas"/>
-          <w:sz w:val="20"/>
-          <w:szCs w:val="20"/>
-          <w:shd w:fill="F0F0F0"/>
+        <w:t xml:space="preserve"> sums by decade): (1) the headline trend — fatalities rose sharply from the 1950s through the 1990s (about 4 to 22 per season, a 5x increase), then flattened; the three most recent decades all sit in a narrow 24-28- per-season band rather than continuing to climb, and the modern era (2000s-2020s) still averages roughly 3.6x the earliest three decades (1950s-1970s), almost entirely from pre-2000 growth; (2) the COVID-era 2020-21 season is the deadliest on record (37 fatalities, more than double the historical average), plausibly driven by a surge of inexperienced backcountry users during the pandemic — a Q2 (human-factors) story surfacing on the Q1 page (see "How these connect").</w:t>
+      </w:r>
+    </w:p>
+    <w:p>
+      <w:pPr>
+        <w:spacing w:after="160"/>
+      </w:pPr>
+      <w:r>
+        <w:rPr>
+          <w:rFonts w:ascii="Calibri" w:cs="Calibri" w:eastAsia="Calibri" w:hAnsi="Calibri"/>
+          <w:b/>
+          <w:bCs/>
+        </w:rPr>
+        <w:t xml:space="preserve">Scoping decision:</w:t>
+      </w:r>
+      <w:r>
+        <w:rPr>
+          <w:rFonts w:ascii="Calibri" w:cs="Calibri" w:eastAsia="Calibri" w:hAnsi="Calibri"/>
+        </w:rPr>
+        <w:t xml:space="preserve"> Colorado was originally meant to get its own spotlight on this page — comparing Colorado fatalities against CAIC's website-engagement data as an exposure proxy, hence the page's original "National trend, with a Colorado spotlight" framing. Two things changed that: (1) the chart didn't fit on Page 1, so it got built as a second tab (</w:t>
+      </w:r>
+      <w:r>
+        <w:rPr>
+          <w:rFonts w:ascii="Consolas" w:cs="Consolas" w:eastAsia="Consolas" w:hAnsi="Consolas"/>
+          <w:sz w:val="20"/>
+          <w:szCs w:val="20"/>
+          <w:shd w:fill="F0F0F0" w:val="clear"/>
         </w:rPr>
         <w:t xml:space="preserve">Q1 pt2</w:t>
       </w:r>
@@ -468,7 +460,7 @@
           <w:rFonts w:ascii="Consolas" w:cs="Consolas" w:eastAsia="Consolas" w:hAnsi="Consolas"/>
           <w:sz w:val="20"/>
           <w:szCs w:val="20"/>
-          <w:shd w:fill="F0F0F0"/>
+          <w:shd w:fill="F0F0F0" w:val="clear"/>
         </w:rPr>
         <w:t xml:space="preserve">Q1 pt2</w:t>
       </w:r>
@@ -489,22 +481,14 @@
           <w:b/>
           <w:bCs/>
         </w:rPr>
-        <w:t xml:space="preserve">Caveats to carry onto the page: </w:t>
-      </w:r>
-      <w:r>
-        <w:rPr>
-          <w:rFonts w:ascii="Calibri" w:cs="Calibri" w:eastAsia="Calibri" w:hAnsi="Calibri"/>
-        </w:rPr>
-        <w:t xml:space="preserve">the 1950s (9 seasons) and 2020s (6 seasons, through 2025) bars on the by-decade chart are partial decades — their totals aren't directly comparable to the other, complete decades, and 2025 itself should be read as a partial, provisional season. Record-keeping also improved over time (see the Data Quality appendix — narrative/location detail only becomes reliable starting in the 2000s-2010s), so part of the long-run rise may reflect better documentation rather than a purely real increase in fatalities, on top of the genuine effect of more people going into the backcountry — which this page can't separate out either (that's why Q5 exists).</w:t>
-      </w:r>
-    </w:p>
-    <w:p>
-      <w:pPr>
-        <w:pBdr>
-          <w:bottom w:val="single" w:color="AAAAAA" w:sz="6" w:space="1"/>
-        </w:pBdr>
-        <w:spacing w:after="240" w:before="120"/>
-      </w:pPr>
+        <w:t xml:space="preserve">Caveats to carry onto the page:</w:t>
+      </w:r>
+      <w:r>
+        <w:rPr>
+          <w:rFonts w:ascii="Calibri" w:cs="Calibri" w:eastAsia="Calibri" w:hAnsi="Calibri"/>
+        </w:rPr>
+        <w:t xml:space="preserve"> the 1950s (9 seasons) and 2020s (6 seasons, through 2025) bars on the by-decade chart are partial decades — their totals aren't directly comparable to the other, complete decades, and 2025 itself should be read as a partial, provisional season. Record-keeping also improved over time (see the Data Quality appendix — narrative/location detail only becomes reliable starting in the 2000s-2010s), so part of the long-run rise may reflect better documentation rather than a purely real increase in fatalities, on top of the genuine effect of more people going into the backcountry — which this page can't separate out either (that's why Q5 exists).</w:t>
+      </w:r>
     </w:p>
     <w:p>
       <w:pPr>
@@ -525,52 +509,58 @@
           <w:b/>
           <w:bCs/>
         </w:rPr>
-        <w:t xml:space="preserve">Question: </w:t>
-      </w:r>
-      <w:r>
-        <w:rPr>
-          <w:rFonts w:ascii="Calibri" w:cs="Calibri" w:eastAsia="Calibri" w:hAnsi="Calibri"/>
-        </w:rPr>
-        <w:t xml:space="preserve">What activities are most associated with fatal accidents, and has that mix changed over the 75-year history of the data?</w:t>
-      </w:r>
-    </w:p>
-    <w:p>
-      <w:pPr>
-        <w:spacing w:after="160"/>
-      </w:pPr>
-      <w:r>
-        <w:rPr>
-          <w:rFonts w:ascii="Calibri" w:cs="Calibri" w:eastAsia="Calibri" w:hAnsi="Calibri"/>
-          <w:b/>
-          <w:bCs/>
-        </w:rPr>
-        <w:t xml:space="preserve">Why it matters: </w:t>
-      </w:r>
-      <w:r>
-        <w:rPr>
-          <w:rFonts w:ascii="Calibri" w:cs="Calibri" w:eastAsia="Calibri" w:hAnsi="Calibri"/>
-        </w:rPr>
-        <w:t xml:space="preserve">This is the most direct line to Tremper's “it's not the avalanche, it's the decision” framing — activity type and access mode are pieces of the story that are actually within a person's control, unlike snowpack conditions.</w:t>
-      </w:r>
-    </w:p>
-    <w:p>
-      <w:pPr>
-        <w:spacing w:after="160"/>
-      </w:pPr>
-      <w:r>
-        <w:rPr>
-          <w:rFonts w:ascii="Calibri" w:cs="Calibri" w:eastAsia="Calibri" w:hAnsi="Calibri"/>
-          <w:b/>
-          <w:bCs/>
-        </w:rPr>
-        <w:t xml:space="preserve">Supports it: </w:t>
-      </w:r>
-      <w:r>
-        <w:rPr>
-          <w:rFonts w:ascii="Consolas" w:cs="Consolas" w:eastAsia="Consolas" w:hAnsi="Consolas"/>
-          <w:sz w:val="20"/>
-          <w:szCs w:val="20"/>
-          <w:shd w:fill="F0F0F0"/>
+        <w:t xml:space="preserve">Question:</w:t>
+      </w:r>
+      <w:r>
+        <w:rPr>
+          <w:rFonts w:ascii="Calibri" w:cs="Calibri" w:eastAsia="Calibri" w:hAnsi="Calibri"/>
+        </w:rPr>
+        <w:t xml:space="preserve"> What activities are most associated with fatal accidents, and has that mix changed over the 75-year history of the data?</w:t>
+      </w:r>
+    </w:p>
+    <w:p>
+      <w:pPr>
+        <w:spacing w:after="160"/>
+      </w:pPr>
+      <w:r>
+        <w:rPr>
+          <w:rFonts w:ascii="Calibri" w:cs="Calibri" w:eastAsia="Calibri" w:hAnsi="Calibri"/>
+          <w:b/>
+          <w:bCs/>
+        </w:rPr>
+        <w:t xml:space="preserve">Why it matters:</w:t>
+      </w:r>
+      <w:r>
+        <w:rPr>
+          <w:rFonts w:ascii="Calibri" w:cs="Calibri" w:eastAsia="Calibri" w:hAnsi="Calibri"/>
+        </w:rPr>
+        <w:t xml:space="preserve"> This is the most direct line to Tremper's "it's not the avalanche, it's the decision" framing — activity type and access mode are pieces of the story that are actually within a person's control, unlike snowpack conditions.</w:t>
+      </w:r>
+    </w:p>
+    <w:p>
+      <w:pPr>
+        <w:spacing w:after="160"/>
+      </w:pPr>
+      <w:r>
+        <w:rPr>
+          <w:rFonts w:ascii="Calibri" w:cs="Calibri" w:eastAsia="Calibri" w:hAnsi="Calibri"/>
+          <w:b/>
+          <w:bCs/>
+        </w:rPr>
+        <w:t xml:space="preserve">Supports it:</w:t>
+      </w:r>
+      <w:r>
+        <w:rPr>
+          <w:rFonts w:ascii="Calibri" w:cs="Calibri" w:eastAsia="Calibri" w:hAnsi="Calibri"/>
+        </w:rPr>
+        <w:t xml:space="preserve"> </w:t>
+      </w:r>
+      <w:r>
+        <w:rPr>
+          <w:rFonts w:ascii="Consolas" w:cs="Consolas" w:eastAsia="Consolas" w:hAnsi="Consolas"/>
+          <w:sz w:val="20"/>
+          <w:szCs w:val="20"/>
+          <w:shd w:fill="F0F0F0" w:val="clear"/>
         </w:rPr>
         <w:t xml:space="preserve">DimActivityCategory</w:t>
       </w:r>
@@ -585,7 +575,7 @@
           <w:rFonts w:ascii="Consolas" w:cs="Consolas" w:eastAsia="Consolas" w:hAnsi="Consolas"/>
           <w:sz w:val="20"/>
           <w:szCs w:val="20"/>
-          <w:shd w:fill="F0F0F0"/>
+          <w:shd w:fill="F0F0F0" w:val="clear"/>
         </w:rPr>
         <w:t xml:space="preserve">PrimaryActivity</w:t>
       </w:r>
@@ -600,7 +590,7 @@
           <w:rFonts w:ascii="Consolas" w:cs="Consolas" w:eastAsia="Consolas" w:hAnsi="Consolas"/>
           <w:sz w:val="20"/>
           <w:szCs w:val="20"/>
-          <w:shd w:fill="F0F0F0"/>
+          <w:shd w:fill="F0F0F0" w:val="clear"/>
         </w:rPr>
         <w:t xml:space="preserve">Decade</w:t>
       </w:r>
@@ -615,7 +605,7 @@
           <w:rFonts w:ascii="Consolas" w:cs="Consolas" w:eastAsia="Consolas" w:hAnsi="Consolas"/>
           <w:sz w:val="20"/>
           <w:szCs w:val="20"/>
-          <w:shd w:fill="F0F0F0"/>
+          <w:shd w:fill="F0F0F0" w:val="clear"/>
         </w:rPr>
         <w:t xml:space="preserve">AvyYear</w:t>
       </w:r>
@@ -636,20 +626,20 @@
           <w:b/>
           <w:bCs/>
         </w:rPr>
-        <w:t xml:space="preserve">Status: Done. </w:t>
-      </w:r>
-      <w:r>
-        <w:rPr>
-          <w:rFonts w:ascii="Calibri" w:cs="Calibri" w:eastAsia="Calibri" w:hAnsi="Calibri"/>
-        </w:rPr>
-        <w:t xml:space="preserve">Built as a two-chart page (</w:t>
-      </w:r>
-      <w:r>
-        <w:rPr>
-          <w:rFonts w:ascii="Consolas" w:cs="Consolas" w:eastAsia="Consolas" w:hAnsi="Consolas"/>
-          <w:sz w:val="20"/>
-          <w:szCs w:val="20"/>
-          <w:shd w:fill="F0F0F0"/>
+        <w:t xml:space="preserve">Status: Done.</w:t>
+      </w:r>
+      <w:r>
+        <w:rPr>
+          <w:rFonts w:ascii="Calibri" w:cs="Calibri" w:eastAsia="Calibri" w:hAnsi="Calibri"/>
+        </w:rPr>
+        <w:t xml:space="preserve"> Built as a two-chart page (</w:t>
+      </w:r>
+      <w:r>
+        <w:rPr>
+          <w:rFonts w:ascii="Consolas" w:cs="Consolas" w:eastAsia="Consolas" w:hAnsi="Consolas"/>
+          <w:sz w:val="20"/>
+          <w:szCs w:val="20"/>
+          <w:shd w:fill="F0F0F0" w:val="clear"/>
         </w:rPr>
         <w:t xml:space="preserve">Q2</w:t>
       </w:r>
@@ -664,7 +654,7 @@
           <w:rFonts w:ascii="Consolas" w:cs="Consolas" w:eastAsia="Consolas" w:hAnsi="Consolas"/>
           <w:sz w:val="20"/>
           <w:szCs w:val="20"/>
-          <w:shd w:fill="F0F0F0"/>
+          <w:shd w:fill="F0F0F0" w:val="clear"/>
         </w:rPr>
         <w:t xml:space="preserve">Total Fatalities</w:t>
       </w:r>
@@ -679,7 +669,7 @@
           <w:rFonts w:ascii="Consolas" w:cs="Consolas" w:eastAsia="Consolas" w:hAnsi="Consolas"/>
           <w:sz w:val="20"/>
           <w:szCs w:val="20"/>
-          <w:shd w:fill="F0F0F0"/>
+          <w:shd w:fill="F0F0F0" w:val="clear"/>
         </w:rPr>
         <w:t xml:space="preserve">ActivityCategory</w:t>
       </w:r>
@@ -694,7 +684,7 @@
           <w:rFonts w:ascii="Consolas" w:cs="Consolas" w:eastAsia="Consolas" w:hAnsi="Consolas"/>
           <w:sz w:val="20"/>
           <w:szCs w:val="20"/>
-          <w:shd w:fill="F0F0F0"/>
+          <w:shd w:fill="F0F0F0" w:val="clear"/>
         </w:rPr>
         <w:t xml:space="preserve">Decade</w:t>
       </w:r>
@@ -702,14 +692,14 @@
         <w:rPr>
           <w:rFonts w:ascii="Calibri" w:cs="Calibri" w:eastAsia="Calibri" w:hAnsi="Calibri"/>
         </w:rPr>
-        <w:t xml:space="preserve">, with a named finding — the collapse of occupational/passive exposure (55%→under 10% since the 2000s) and the rise of motorized backcountry recreation (0%→over 40% by the 2000s, tracking the real snowmobile-access boom) are the two biggest structural shifts in who avalanches kill. Both charts checked against </w:t>
-      </w:r>
-      <w:r>
-        <w:rPr>
-          <w:rFonts w:ascii="Consolas" w:cs="Consolas" w:eastAsia="Consolas" w:hAnsi="Consolas"/>
-          <w:sz w:val="20"/>
-          <w:szCs w:val="20"/>
-          <w:shd w:fill="F0F0F0"/>
+        <w:t xml:space="preserve">, with a named finding — the collapse of occupational/ passive exposure (54%→3% since the 1950s/60s) and the rise of motorized backcountry recreation (1%→31%, tracking the real snowmobile-access boom) are the two biggest structural shifts in who avalanches kill; motorized backcountry recreation is now one of the two largest categories. Both charts checked against </w:t>
+      </w:r>
+      <w:r>
+        <w:rPr>
+          <w:rFonts w:ascii="Consolas" w:cs="Consolas" w:eastAsia="Consolas" w:hAnsi="Consolas"/>
+          <w:sz w:val="20"/>
+          <w:szCs w:val="20"/>
+          <w:shd w:fill="F0F0F0" w:val="clear"/>
         </w:rPr>
         <w:t xml:space="preserve">PrimaryActivity</w:t>
       </w:r>
@@ -730,20 +720,20 @@
           <w:b/>
           <w:bCs/>
         </w:rPr>
-        <w:t xml:space="preserve">Scoping decision, 2026-09-15: </w:t>
-      </w:r>
-      <w:r>
-        <w:rPr>
-          <w:rFonts w:ascii="Calibri" w:cs="Calibri" w:eastAsia="Calibri" w:hAnsi="Calibri"/>
-        </w:rPr>
-        <w:t xml:space="preserve">a third piece was designed but deliberately cut — a “modern-era circumstances” panel using </w:t>
-      </w:r>
-      <w:r>
-        <w:rPr>
-          <w:rFonts w:ascii="Consolas" w:cs="Consolas" w:eastAsia="Consolas" w:hAnsi="Consolas"/>
-          <w:sz w:val="20"/>
-          <w:szCs w:val="20"/>
-          <w:shd w:fill="F0F0F0"/>
+        <w:t xml:space="preserve">Scoping decision, 2026-09-15:</w:t>
+      </w:r>
+      <w:r>
+        <w:rPr>
+          <w:rFonts w:ascii="Calibri" w:cs="Calibri" w:eastAsia="Calibri" w:hAnsi="Calibri"/>
+        </w:rPr>
+        <w:t xml:space="preserve"> a third piece was designed but deliberately cut — a "modern-era circumstances" panel using </w:t>
+      </w:r>
+      <w:r>
+        <w:rPr>
+          <w:rFonts w:ascii="Consolas" w:cs="Consolas" w:eastAsia="Consolas" w:hAnsi="Consolas"/>
+          <w:sz w:val="20"/>
+          <w:szCs w:val="20"/>
+          <w:shd w:fill="F0F0F0" w:val="clear"/>
         </w:rPr>
         <w:t xml:space="preserve">MentionsInjured</w:t>
       </w:r>
@@ -758,7 +748,7 @@
           <w:rFonts w:ascii="Consolas" w:cs="Consolas" w:eastAsia="Consolas" w:hAnsi="Consolas"/>
           <w:sz w:val="20"/>
           <w:szCs w:val="20"/>
-          <w:shd w:fill="F0F0F0"/>
+          <w:shd w:fill="F0F0F0" w:val="clear"/>
         </w:rPr>
         <w:t xml:space="preserve">MentionsCriticalBurial</w:t>
       </w:r>
@@ -773,7 +763,7 @@
           <w:rFonts w:ascii="Consolas" w:cs="Consolas" w:eastAsia="Consolas" w:hAnsi="Consolas"/>
           <w:sz w:val="20"/>
           <w:szCs w:val="20"/>
-          <w:shd w:fill="F0F0F0"/>
+          <w:shd w:fill="F0F0F0" w:val="clear"/>
         </w:rPr>
         <w:t xml:space="preserve">AlternateCause</w:t>
       </w:r>
@@ -781,14 +771,14 @@
         <w:rPr>
           <w:rFonts w:ascii="Calibri" w:cs="Calibri" w:eastAsia="Calibri" w:hAnsi="Calibri"/>
         </w:rPr>
-        <w:t xml:space="preserve">, and a “people caught per person killed” ratio from </w:t>
-      </w:r>
-      <w:r>
-        <w:rPr>
-          <w:rFonts w:ascii="Consolas" w:cs="Consolas" w:eastAsia="Consolas" w:hAnsi="Consolas"/>
-          <w:sz w:val="20"/>
-          <w:szCs w:val="20"/>
-          <w:shd w:fill="F0F0F0"/>
+        <w:t xml:space="preserve">, and a "people caught per person killed" ratio from </w:t>
+      </w:r>
+      <w:r>
+        <w:rPr>
+          <w:rFonts w:ascii="Consolas" w:cs="Consolas" w:eastAsia="Consolas" w:hAnsi="Consolas"/>
+          <w:sz w:val="20"/>
+          <w:szCs w:val="20"/>
+          <w:shd w:fill="F0F0F0" w:val="clear"/>
         </w:rPr>
         <w:t xml:space="preserve">PeopleCaught</w:t>
       </w:r>
@@ -796,14 +786,14 @@
         <w:rPr>
           <w:rFonts w:ascii="Calibri" w:cs="Calibri" w:eastAsia="Calibri" w:hAnsi="Calibri"/>
         </w:rPr>
-        <w:t xml:space="preserve">/</w:t>
-      </w:r>
-      <w:r>
-        <w:rPr>
-          <w:rFonts w:ascii="Consolas" w:cs="Consolas" w:eastAsia="Consolas" w:hAnsi="Consolas"/>
-          <w:sz w:val="20"/>
-          <w:szCs w:val="20"/>
-          <w:shd w:fill="F0F0F0"/>
+        <w:t xml:space="preserve">/ </w:t>
+      </w:r>
+      <w:r>
+        <w:rPr>
+          <w:rFonts w:ascii="Consolas" w:cs="Consolas" w:eastAsia="Consolas" w:hAnsi="Consolas"/>
+          <w:sz w:val="20"/>
+          <w:szCs w:val="20"/>
+          <w:shd w:fill="F0F0F0" w:val="clear"/>
         </w:rPr>
         <w:t xml:space="preserve">PeopleCaughtParsed</w:t>
       </w:r>
@@ -818,7 +808,7 @@
           <w:rFonts w:ascii="Consolas" w:cs="Consolas" w:eastAsia="Consolas" w:hAnsi="Consolas"/>
           <w:sz w:val="20"/>
           <w:szCs w:val="20"/>
-          <w:shd w:fill="F0F0F0"/>
+          <w:shd w:fill="F0F0F0" w:val="clear"/>
         </w:rPr>
         <w:t xml:space="preserve">Description</w:t>
       </w:r>
@@ -826,33 +816,92 @@
         <w:rPr>
           <w:rFonts w:ascii="Calibri" w:cs="Calibri" w:eastAsia="Calibri" w:hAnsi="Calibri"/>
         </w:rPr>
-        <w:t xml:space="preserve"> is a single 1986 outlier, then nothing until 2013), and 4 of the 6 activity categories have single-digit-to-teens sample sizes in that window. It would have extended Q2 into the “circumstances” half of the question, but on meaningfully weaker evidence than the two charts already built. Cut in favor of keeping Q2 resting on its strongest material — not because the idea was wrong, just lower priority than the rest of the project's scope.</w:t>
-      </w:r>
-    </w:p>
-    <w:p>
-      <w:pPr>
-        <w:spacing w:after="160"/>
-      </w:pPr>
-      <w:r>
-        <w:rPr>
-          <w:rFonts w:ascii="Calibri" w:cs="Calibri" w:eastAsia="Calibri" w:hAnsi="Calibri"/>
-          <w:b/>
-          <w:bCs/>
-        </w:rPr>
-        <w:t xml:space="preserve">Caveats carried onto the page: </w:t>
-      </w:r>
-      <w:r>
-        <w:rPr>
-          <w:rFonts w:ascii="Calibri" w:cs="Calibri" w:eastAsia="Calibri" w:hAnsi="Calibri"/>
-        </w:rPr>
-        <w:t xml:space="preserve">activity categories are an analytical judgment call, not a CAIC-defined taxonomy; categorical fields like </w:t>
-      </w:r>
-      <w:r>
-        <w:rPr>
-          <w:rFonts w:ascii="Consolas" w:cs="Consolas" w:eastAsia="Consolas" w:hAnsi="Consolas"/>
-          <w:sz w:val="20"/>
-          <w:szCs w:val="20"/>
-          <w:shd w:fill="F0F0F0"/>
+        <w:t xml:space="preserve"> is a single 1986 outlier, then nothing until 2013 — see </w:t>
+      </w:r>
+      <w:r>
+        <w:rPr>
+          <w:rFonts w:ascii="Consolas" w:cs="Consolas" w:eastAsia="Consolas" w:hAnsi="Consolas"/>
+          <w:sz w:val="20"/>
+          <w:szCs w:val="20"/>
+          <w:shd w:fill="F0F0F0" w:val="clear"/>
+        </w:rPr>
+        <w:t xml:space="preserve">fact_table_data_dictionary.md</w:t>
+      </w:r>
+      <w:r>
+        <w:rPr>
+          <w:rFonts w:ascii="Calibri" w:cs="Calibri" w:eastAsia="Calibri" w:hAnsi="Calibri"/>
+        </w:rPr>
+        <w:t xml:space="preserve">), and 4 of the 6 activity categories have single-digit-to-teens sample sizes in that window. It would have extended Q2 into the "circumstances" half of the question (group exposure, incident severity), but on meaningfully weaker evidence than the two charts already built. Cut in favor of keeping Q2 resting on its strongest material rather than diluting it with a thin, exploratory add-on — not because the idea was wrong, just lower priority than the rest of the project's scope. </w:t>
+      </w:r>
+      <w:r>
+        <w:rPr>
+          <w:rFonts w:ascii="Calibri" w:cs="Calibri" w:eastAsia="Calibri" w:hAnsi="Calibri"/>
+          <w:b/>
+          <w:bCs/>
+        </w:rPr>
+        <w:t xml:space="preserve">Update, Q4 build:</w:t>
+      </w:r>
+      <w:r>
+        <w:rPr>
+          <w:rFonts w:ascii="Calibri" w:cs="Calibri" w:eastAsia="Calibri" w:hAnsi="Calibri"/>
+        </w:rPr>
+        <w:t xml:space="preserve"> the </w:t>
+      </w:r>
+      <w:r>
+        <w:rPr>
+          <w:rFonts w:ascii="Consolas" w:cs="Consolas" w:eastAsia="Consolas" w:hAnsi="Consolas"/>
+          <w:sz w:val="20"/>
+          <w:szCs w:val="20"/>
+          <w:shd w:fill="F0F0F0" w:val="clear"/>
+        </w:rPr>
+        <w:t xml:space="preserve">PeopleCaughtParsed</w:t>
+      </w:r>
+      <w:r>
+        <w:rPr>
+          <w:rFonts w:ascii="Calibri" w:cs="Calibri" w:eastAsia="Calibri" w:hAnsi="Calibri"/>
+        </w:rPr>
+        <w:t xml:space="preserve"> field didn't stay cut for good; it resurfaced on Q4 as a single-fatality-vs-multi-fatality survival-rate KPI, scoped to the same 2013-2025 window and labeled with its small sample size there. The "circumstances" panel itself (mentions-injured, critical-burial, alternate-cause) is still cut from Q2 and remains a possible future addition, not a gap that needs filling before either page is considered done.</w:t>
+      </w:r>
+    </w:p>
+    <w:p>
+      <w:pPr>
+        <w:spacing w:after="160"/>
+      </w:pPr>
+      <w:r>
+        <w:rPr>
+          <w:rFonts w:ascii="Calibri" w:cs="Calibri" w:eastAsia="Calibri" w:hAnsi="Calibri"/>
+          <w:b/>
+          <w:bCs/>
+        </w:rPr>
+        <w:t xml:space="preserve">Caveats carried onto the page:</w:t>
+      </w:r>
+      <w:r>
+        <w:rPr>
+          <w:rFonts w:ascii="Calibri" w:cs="Calibri" w:eastAsia="Calibri" w:hAnsi="Calibri"/>
+        </w:rPr>
+        <w:t xml:space="preserve"> activity categories are an analytical judgment call, not a CAIC-defined taxonomy (see </w:t>
+      </w:r>
+      <w:r>
+        <w:rPr>
+          <w:rFonts w:ascii="Consolas" w:cs="Consolas" w:eastAsia="Consolas" w:hAnsi="Consolas"/>
+          <w:sz w:val="20"/>
+          <w:szCs w:val="20"/>
+          <w:shd w:fill="F0F0F0" w:val="clear"/>
+        </w:rPr>
+        <w:t xml:space="preserve">activity_category_data_dictionary.md</w:t>
+      </w:r>
+      <w:r>
+        <w:rPr>
+          <w:rFonts w:ascii="Calibri" w:cs="Calibri" w:eastAsia="Calibri" w:hAnsi="Calibri"/>
+        </w:rPr>
+        <w:t xml:space="preserve">); categorical fields like </w:t>
+      </w:r>
+      <w:r>
+        <w:rPr>
+          <w:rFonts w:ascii="Consolas" w:cs="Consolas" w:eastAsia="Consolas" w:hAnsi="Consolas"/>
+          <w:sz w:val="20"/>
+          <w:szCs w:val="20"/>
+          <w:shd w:fill="F0F0F0" w:val="clear"/>
         </w:rPr>
         <w:t xml:space="preserve">PrimaryActivity</w:t>
       </w:r>
@@ -860,16 +909,8 @@
         <w:rPr>
           <w:rFonts w:ascii="Calibri" w:cs="Calibri" w:eastAsia="Calibri" w:hAnsi="Calibri"/>
         </w:rPr>
-        <w:t xml:space="preserve"> reflect individual investigator judgment, not a standardized taxonomy applied consistently across 75 years (Spencer Logan, CAIC) — an apparent shift in mix may partly reflect changing investigator conventions, not just changing conditions on the mountain; the “Occupational, Passive &amp; Other” category is a deliberate grab-bag and its position on the (value-sorted) composition chart reflects size, not coherence.</w:t>
-      </w:r>
-    </w:p>
-    <w:p>
-      <w:pPr>
-        <w:pBdr>
-          <w:bottom w:val="single" w:color="AAAAAA" w:sz="6" w:space="1"/>
-        </w:pBdr>
-        <w:spacing w:after="240" w:before="120"/>
-      </w:pPr>
+        <w:t xml:space="preserve"> reflect individual investigator judgment, not a standardized taxonomy applied consistently across 75 years (Spencer Logan, CAIC) — an apparent shift in mix may partly reflect changing investigator conventions, not just changing conditions on the mountain; the "Occupational, Passive &amp; Other" category is a deliberate grab-bag and its position on the (value-sorted) composition chart reflects size, not coherence.</w:t>
+      </w:r>
     </w:p>
     <w:p>
       <w:pPr>
@@ -890,52 +931,117 @@
           <w:b/>
           <w:bCs/>
         </w:rPr>
-        <w:t xml:space="preserve">Question: </w:t>
-      </w:r>
-      <w:r>
-        <w:rPr>
-          <w:rFonts w:ascii="Calibri" w:cs="Calibri" w:eastAsia="Calibri" w:hAnsi="Calibri"/>
-        </w:rPr>
-        <w:t xml:space="preserve">When (month/season timing) and where (setting: backcountry, ski area, road, etc.) do fatal accidents cluster, and how does Colorado's distribution compare to the national one?</w:t>
-      </w:r>
-    </w:p>
-    <w:p>
-      <w:pPr>
-        <w:spacing w:after="160"/>
-      </w:pPr>
-      <w:r>
-        <w:rPr>
-          <w:rFonts w:ascii="Calibri" w:cs="Calibri" w:eastAsia="Calibri" w:hAnsi="Calibri"/>
-          <w:b/>
-          <w:bCs/>
-        </w:rPr>
-        <w:t xml:space="preserve">Why it matters: </w:t>
-      </w:r>
-      <w:r>
-        <w:rPr>
-          <w:rFonts w:ascii="Calibri" w:cs="Calibri" w:eastAsia="Calibri" w:hAnsi="Calibri"/>
-        </w:rPr>
-        <w:t xml:space="preserve">There are two separate reasons to look at Colorado on its own here, not just one, and they're worth keeping distinct. (1) A real scientific reason to expect a genuine difference: Colorado is widely known in avalanche science for having one of the most dangerous snowpacks in the world — its continental (cold, dry) snowpack develops persistent weak layers early in the season (faceted grains/depth hoar) that can linger and produce deep slab instability all winter, unlike maritime snowpacks (e.g. the Cascades, Sierra Nevada) that tend to stabilize faster. Tremper's book covers this distinction directly. That's an independent reason to expect Colorado's when/where pattern to genuinely differ from the national one — not just a data artifact to correct for. (2) A data-quality reason to trust Colorado's numbers more: this is where the CAIC Setting-code confirmation and Spencer Logan's investigator-subjectivity caveat matter most directly — this question is explicitly a cross-region, cross-era comparison, which is exactly the kind of comparison he warned is weakest in this dataset. Colorado's rows are the most internally consistent subset (CAIC staff investigated them directly; other states' incidents were only compiled from other sources). Put together: a real scientific reason to expect Colorado to look different, and a real methodological reason to trust Colorado's numbers more — which is why this page compares Colorado against the rest of the nation side by side rather than blending all 1,016 rows into one national answer.</w:t>
-      </w:r>
-    </w:p>
-    <w:p>
-      <w:pPr>
-        <w:spacing w:after="160"/>
-      </w:pPr>
-      <w:r>
-        <w:rPr>
-          <w:rFonts w:ascii="Calibri" w:cs="Calibri" w:eastAsia="Calibri" w:hAnsi="Calibri"/>
-          <w:b/>
-          <w:bCs/>
-        </w:rPr>
-        <w:t xml:space="preserve">Supports it: </w:t>
-      </w:r>
-      <w:r>
-        <w:rPr>
-          <w:rFonts w:ascii="Consolas" w:cs="Consolas" w:eastAsia="Consolas" w:hAnsi="Consolas"/>
-          <w:sz w:val="20"/>
-          <w:szCs w:val="20"/>
-          <w:shd w:fill="F0F0F0"/>
+        <w:t xml:space="preserve">Question:</w:t>
+      </w:r>
+      <w:r>
+        <w:rPr>
+          <w:rFonts w:ascii="Calibri" w:cs="Calibri" w:eastAsia="Calibri" w:hAnsi="Calibri"/>
+        </w:rPr>
+        <w:t xml:space="preserve"> When (month/season timing) and where (setting: backcountry, ski area, road, etc.) do fatal accidents cluster, and how does Colorado's distribution compare to the national one?</w:t>
+      </w:r>
+    </w:p>
+    <w:p>
+      <w:pPr>
+        <w:spacing w:after="160"/>
+      </w:pPr>
+      <w:r>
+        <w:rPr>
+          <w:rFonts w:ascii="Calibri" w:cs="Calibri" w:eastAsia="Calibri" w:hAnsi="Calibri"/>
+          <w:b/>
+          <w:bCs/>
+        </w:rPr>
+        <w:t xml:space="preserve">Why it matters:</w:t>
+      </w:r>
+      <w:r>
+        <w:rPr>
+          <w:rFonts w:ascii="Calibri" w:cs="Calibri" w:eastAsia="Calibri" w:hAnsi="Calibri"/>
+        </w:rPr>
+        <w:t xml:space="preserve"> There are two separate reasons to look at Colorado on its own here, not just one, and they're worth keeping distinct:</w:t>
+      </w:r>
+    </w:p>
+    <w:p>
+      <w:pPr>
+        <w:pStyle w:val="ListParagraph"/>
+        <w:numPr>
+          <w:ilvl w:val="0"/>
+          <w:numId w:val="2"/>
+        </w:numPr>
+        <w:spacing w:after="160"/>
+      </w:pPr>
+      <w:r>
+        <w:rPr>
+          <w:rFonts w:ascii="Calibri" w:cs="Calibri" w:eastAsia="Calibri" w:hAnsi="Calibri"/>
+          <w:b/>
+          <w:bCs/>
+        </w:rPr>
+        <w:t xml:space="preserve">A real scientific reason to expect a genuine difference.</w:t>
+      </w:r>
+      <w:r>
+        <w:rPr>
+          <w:rFonts w:ascii="Calibri" w:cs="Calibri" w:eastAsia="Calibri" w:hAnsi="Calibri"/>
+        </w:rPr>
+        <w:t xml:space="preserve"> Colorado is widely known in avalanche science for having one of the most dangerous snowpacks in the world — its continental (cold, dry) snowpack develops persistent weak layers early in the season (faceted grains/depth hoar) that can linger and produce deep slab instability all winter, unlike maritime snowpacks (e.g. the Cascades, Sierra Nevada) that tend to stabilize faster. Tremper's book covers this distinction directly. That's an independent reason to *expect* Colorado's when/where pattern to genuinely differ from the national one — not just a data artifact to correct for.</w:t>
+      </w:r>
+    </w:p>
+    <w:p>
+      <w:pPr>
+        <w:pStyle w:val="ListParagraph"/>
+        <w:numPr>
+          <w:ilvl w:val="0"/>
+          <w:numId w:val="2"/>
+        </w:numPr>
+        <w:spacing w:after="160"/>
+      </w:pPr>
+      <w:r>
+        <w:rPr>
+          <w:rFonts w:ascii="Calibri" w:cs="Calibri" w:eastAsia="Calibri" w:hAnsi="Calibri"/>
+          <w:b/>
+          <w:bCs/>
+        </w:rPr>
+        <w:t xml:space="preserve">A data-quality reason to trust Colorado's numbers more.</w:t>
+      </w:r>
+      <w:r>
+        <w:rPr>
+          <w:rFonts w:ascii="Calibri" w:cs="Calibri" w:eastAsia="Calibri" w:hAnsi="Calibri"/>
+        </w:rPr>
+        <w:t xml:space="preserve"> This is where the CAIC Setting-code confirmation and Spencer Logan's investigator- subjectivity caveat matter most directly — this question is explicitly a cross-region, cross-era comparison, which is exactly the kind of comparison he warned is weakest in this dataset. Colorado's rows are the most internally consistent subset (CAIC staff investigated them directly; other states' incidents were only compiled from other sources).</w:t>
+      </w:r>
+    </w:p>
+    <w:p>
+      <w:pPr>
+        <w:spacing w:after="160"/>
+      </w:pPr>
+      <w:r>
+        <w:rPr>
+          <w:rFonts w:ascii="Calibri" w:cs="Calibri" w:eastAsia="Calibri" w:hAnsi="Calibri"/>
+        </w:rPr>
+        <w:t xml:space="preserve">Put together: we have a real scientific reason to *expect* Colorado to look different, and a real methodological reason to *trust* Colorado's numbers more than the rest of the dataset's — which is exactly why this page compares Colorado against the rest of the nation side by side rather than blending all 1,016 rows into one national answer.</w:t>
+      </w:r>
+    </w:p>
+    <w:p>
+      <w:pPr>
+        <w:spacing w:after="160"/>
+      </w:pPr>
+      <w:r>
+        <w:rPr>
+          <w:rFonts w:ascii="Calibri" w:cs="Calibri" w:eastAsia="Calibri" w:hAnsi="Calibri"/>
+          <w:b/>
+          <w:bCs/>
+        </w:rPr>
+        <w:t xml:space="preserve">Supports it:</w:t>
+      </w:r>
+      <w:r>
+        <w:rPr>
+          <w:rFonts w:ascii="Calibri" w:cs="Calibri" w:eastAsia="Calibri" w:hAnsi="Calibri"/>
+        </w:rPr>
+        <w:t xml:space="preserve"> </w:t>
+      </w:r>
+      <w:r>
+        <w:rPr>
+          <w:rFonts w:ascii="Consolas" w:cs="Consolas" w:eastAsia="Consolas" w:hAnsi="Consolas"/>
+          <w:sz w:val="20"/>
+          <w:szCs w:val="20"/>
+          <w:shd w:fill="F0F0F0" w:val="clear"/>
         </w:rPr>
         <w:t xml:space="preserve">SettingLabel</w:t>
       </w:r>
@@ -950,7 +1056,7 @@
           <w:rFonts w:ascii="Consolas" w:cs="Consolas" w:eastAsia="Consolas" w:hAnsi="Consolas"/>
           <w:sz w:val="20"/>
           <w:szCs w:val="20"/>
-          <w:shd w:fill="F0F0F0"/>
+          <w:shd w:fill="F0F0F0" w:val="clear"/>
         </w:rPr>
         <w:t xml:space="preserve">IsClosedTerrain</w:t>
       </w:r>
@@ -965,7 +1071,7 @@
           <w:rFonts w:ascii="Consolas" w:cs="Consolas" w:eastAsia="Consolas" w:hAnsi="Consolas"/>
           <w:sz w:val="20"/>
           <w:szCs w:val="20"/>
-          <w:shd w:fill="F0F0F0"/>
+          <w:shd w:fill="F0F0F0" w:val="clear"/>
         </w:rPr>
         <w:t xml:space="preserve">HasLocation</w:t>
       </w:r>
@@ -980,7 +1086,7 @@
           <w:rFonts w:ascii="Consolas" w:cs="Consolas" w:eastAsia="Consolas" w:hAnsi="Consolas"/>
           <w:sz w:val="20"/>
           <w:szCs w:val="20"/>
-          <w:shd w:fill="F0F0F0"/>
+          <w:shd w:fill="F0F0F0" w:val="clear"/>
         </w:rPr>
         <w:t xml:space="preserve">Region</w:t>
       </w:r>
@@ -995,7 +1101,7 @@
           <w:rFonts w:ascii="Consolas" w:cs="Consolas" w:eastAsia="Consolas" w:hAnsi="Consolas"/>
           <w:sz w:val="20"/>
           <w:szCs w:val="20"/>
-          <w:shd w:fill="F0F0F0"/>
+          <w:shd w:fill="F0F0F0" w:val="clear"/>
         </w:rPr>
         <w:t xml:space="preserve">DimMonth</w:t>
       </w:r>
@@ -1010,7 +1116,7 @@
           <w:rFonts w:ascii="Consolas" w:cs="Consolas" w:eastAsia="Consolas" w:hAnsi="Consolas"/>
           <w:sz w:val="20"/>
           <w:szCs w:val="20"/>
-          <w:shd w:fill="F0F0F0"/>
+          <w:shd w:fill="F0F0F0" w:val="clear"/>
         </w:rPr>
         <w:t xml:space="preserve">MonthName</w:t>
       </w:r>
@@ -1025,7 +1131,7 @@
           <w:rFonts w:ascii="Consolas" w:cs="Consolas" w:eastAsia="Consolas" w:hAnsi="Consolas"/>
           <w:sz w:val="20"/>
           <w:szCs w:val="20"/>
-          <w:shd w:fill="F0F0F0"/>
+          <w:shd w:fill="F0F0F0" w:val="clear"/>
         </w:rPr>
         <w:t xml:space="preserve">SeasonMonthOrder</w:t>
       </w:r>
@@ -1046,20 +1152,20 @@
           <w:b/>
           <w:bCs/>
         </w:rPr>
-        <w:t xml:space="preserve">Status: Done. </w:t>
-      </w:r>
-      <w:r>
-        <w:rPr>
-          <w:rFonts w:ascii="Calibri" w:cs="Calibri" w:eastAsia="Calibri" w:hAnsi="Calibri"/>
-        </w:rPr>
-        <w:t xml:space="preserve">Built as a two-chart page (</w:t>
-      </w:r>
-      <w:r>
-        <w:rPr>
-          <w:rFonts w:ascii="Consolas" w:cs="Consolas" w:eastAsia="Consolas" w:hAnsi="Consolas"/>
-          <w:sz w:val="20"/>
-          <w:szCs w:val="20"/>
-          <w:shd w:fill="F0F0F0"/>
+        <w:t xml:space="preserve">Status: Done.</w:t>
+      </w:r>
+      <w:r>
+        <w:rPr>
+          <w:rFonts w:ascii="Calibri" w:cs="Calibri" w:eastAsia="Calibri" w:hAnsi="Calibri"/>
+        </w:rPr>
+        <w:t xml:space="preserve"> Built as a two-chart page (</w:t>
+      </w:r>
+      <w:r>
+        <w:rPr>
+          <w:rFonts w:ascii="Consolas" w:cs="Consolas" w:eastAsia="Consolas" w:hAnsi="Consolas"/>
+          <w:sz w:val="20"/>
+          <w:szCs w:val="20"/>
+          <w:shd w:fill="F0F0F0" w:val="clear"/>
         </w:rPr>
         <w:t xml:space="preserve">Q3</w:t>
       </w:r>
@@ -1074,7 +1180,7 @@
           <w:rFonts w:ascii="Consolas" w:cs="Consolas" w:eastAsia="Consolas" w:hAnsi="Consolas"/>
           <w:sz w:val="20"/>
           <w:szCs w:val="20"/>
-          <w:shd w:fill="F0F0F0"/>
+          <w:shd w:fill="F0F0F0" w:val="clear"/>
         </w:rPr>
         <w:t xml:space="preserve">% of Region Total</w:t>
       </w:r>
@@ -1089,7 +1195,7 @@
           <w:rFonts w:ascii="Consolas" w:cs="Consolas" w:eastAsia="Consolas" w:hAnsi="Consolas"/>
           <w:sz w:val="20"/>
           <w:szCs w:val="20"/>
-          <w:shd w:fill="F0F0F0"/>
+          <w:shd w:fill="F0F0F0" w:val="clear"/>
         </w:rPr>
         <w:t xml:space="preserve">MonthName</w:t>
       </w:r>
@@ -1104,7 +1210,7 @@
           <w:rFonts w:ascii="Consolas" w:cs="Consolas" w:eastAsia="Consolas" w:hAnsi="Consolas"/>
           <w:sz w:val="20"/>
           <w:szCs w:val="20"/>
-          <w:shd w:fill="F0F0F0"/>
+          <w:shd w:fill="F0F0F0" w:val="clear"/>
         </w:rPr>
         <w:t xml:space="preserve">DimMonth</w:t>
       </w:r>
@@ -1119,7 +1225,7 @@
           <w:rFonts w:ascii="Consolas" w:cs="Consolas" w:eastAsia="Consolas" w:hAnsi="Consolas"/>
           <w:sz w:val="20"/>
           <w:szCs w:val="20"/>
-          <w:shd w:fill="F0F0F0"/>
+          <w:shd w:fill="F0F0F0" w:val="clear"/>
         </w:rPr>
         <w:t xml:space="preserve">Region</w:t>
       </w:r>
@@ -1134,7 +1240,7 @@
           <w:rFonts w:ascii="Consolas" w:cs="Consolas" w:eastAsia="Consolas" w:hAnsi="Consolas"/>
           <w:sz w:val="20"/>
           <w:szCs w:val="20"/>
-          <w:shd w:fill="F0F0F0"/>
+          <w:shd w:fill="F0F0F0" w:val="clear"/>
         </w:rPr>
         <w:t xml:space="preserve">SettingLabel</w:t>
       </w:r>
@@ -1149,7 +1255,7 @@
           <w:rFonts w:ascii="Consolas" w:cs="Consolas" w:eastAsia="Consolas" w:hAnsi="Consolas"/>
           <w:sz w:val="20"/>
           <w:szCs w:val="20"/>
-          <w:shd w:fill="F0F0F0"/>
+          <w:shd w:fill="F0F0F0" w:val="clear"/>
         </w:rPr>
         <w:t xml:space="preserve">Region</w:t>
       </w:r>
@@ -1164,7 +1270,7 @@
           <w:rFonts w:ascii="Consolas" w:cs="Consolas" w:eastAsia="Consolas" w:hAnsi="Consolas"/>
           <w:sz w:val="20"/>
           <w:szCs w:val="20"/>
-          <w:shd w:fill="F0F0F0"/>
+          <w:shd w:fill="F0F0F0" w:val="clear"/>
         </w:rPr>
         <w:t xml:space="preserve">fact_table_data_dictionary.md</w:t>
       </w:r>
@@ -1179,7 +1285,7 @@
           <w:rFonts w:ascii="Consolas" w:cs="Consolas" w:eastAsia="Consolas" w:hAnsi="Consolas"/>
           <w:sz w:val="20"/>
           <w:szCs w:val="20"/>
-          <w:shd w:fill="F0F0F0"/>
+          <w:shd w:fill="F0F0F0" w:val="clear"/>
         </w:rPr>
         <w:t xml:space="preserve">Region</w:t>
       </w:r>
@@ -1194,9 +1300,9 @@
           <w:rFonts w:ascii="Consolas" w:cs="Consolas" w:eastAsia="Consolas" w:hAnsi="Consolas"/>
           <w:sz w:val="20"/>
           <w:szCs w:val="20"/>
-          <w:shd w:fill="F0F0F0"/>
-        </w:rPr>
-        <w:t xml:space="preserve">IF(State = “CO”, “Colorado”, “Rest of Nation”)</w:t>
+          <w:shd w:fill="F0F0F0" w:val="clear"/>
+        </w:rPr>
+        <w:t xml:space="preserve">IF(State = "CO", "Colorado", "Rest of Nation")</w:t>
       </w:r>
       <w:r>
         <w:rPr>
@@ -1209,7 +1315,7 @@
           <w:rFonts w:ascii="Consolas" w:cs="Consolas" w:eastAsia="Consolas" w:hAnsi="Consolas"/>
           <w:sz w:val="20"/>
           <w:szCs w:val="20"/>
-          <w:shd w:fill="F0F0F0"/>
+          <w:shd w:fill="F0F0F0" w:val="clear"/>
         </w:rPr>
         <w:t xml:space="preserve">DimMonth</w:t>
       </w:r>
@@ -1230,22 +1336,14 @@
           <w:b/>
           <w:bCs/>
         </w:rPr>
-        <w:t xml:space="preserve">Caveats to carry onto the page: </w:t>
-      </w:r>
-      <w:r>
-        <w:rPr>
-          <w:rFonts w:ascii="Calibri" w:cs="Calibri" w:eastAsia="Calibri" w:hAnsi="Calibri"/>
-        </w:rPr>
-        <w:t xml:space="preserve">Setting and other categorical fields reflect individual investigator judgment, not a standardized taxonomy, and incidents outside Colorado were compiled by CAIC, not investigated by CAIC staff. This is the page where that limitation is most likely to distort a finding if it isn't surfaced — Colorado's own rows are the most internally consistent subset of the data and should be called out as such. At the same time, don't let that caveat get read as “so any CO/rest-of-nation difference is probably just noise” — Colorado's snowpack really is different, so a real difference showing up on this page would be consistent with established avalanche science, not just something to explain away.</w:t>
-      </w:r>
-    </w:p>
-    <w:p>
-      <w:pPr>
-        <w:pBdr>
-          <w:bottom w:val="single" w:color="AAAAAA" w:sz="6" w:space="1"/>
-        </w:pBdr>
-        <w:spacing w:after="240" w:before="120"/>
-      </w:pPr>
+        <w:t xml:space="preserve">Caveats to carry onto the page:</w:t>
+      </w:r>
+      <w:r>
+        <w:rPr>
+          <w:rFonts w:ascii="Calibri" w:cs="Calibri" w:eastAsia="Calibri" w:hAnsi="Calibri"/>
+        </w:rPr>
+        <w:t xml:space="preserve"> Setting and other categorical fields reflect individual investigator judgment, not a standardized taxonomy, and incidents outside Colorado were compiled by CAIC, not investigated by CAIC staff. This is the page where that limitation is most likely to distort a finding if it isn't surfaced — Colorado's own rows are the most internally consistent subset of the data and should be called out as such. At the same time, don't let that caveat get read as "so any CO/rest-of-nation difference is probably just noise" — Colorado's snowpack really is different, so a real difference showing up on this page would be consistent with established avalanche science, not just something to explain away.</w:t>
+      </w:r>
     </w:p>
     <w:p>
       <w:pPr>
@@ -1266,52 +1364,58 @@
           <w:b/>
           <w:bCs/>
         </w:rPr>
-        <w:t xml:space="preserve">Question: </w:t>
-      </w:r>
-      <w:r>
-        <w:rPr>
-          <w:rFonts w:ascii="Calibri" w:cs="Calibri" w:eastAsia="Calibri" w:hAnsi="Calibri"/>
-        </w:rPr>
-        <w:t xml:space="preserve">How often does a single avalanche kill more than one person, and what distinguishes those group-loss events from single-fatality ones?</w:t>
-      </w:r>
-    </w:p>
-    <w:p>
-      <w:pPr>
-        <w:spacing w:after="160"/>
-      </w:pPr>
-      <w:r>
-        <w:rPr>
-          <w:rFonts w:ascii="Calibri" w:cs="Calibri" w:eastAsia="Calibri" w:hAnsi="Calibri"/>
-          <w:b/>
-          <w:bCs/>
-        </w:rPr>
-        <w:t xml:space="preserve">Why it matters: </w:t>
-      </w:r>
-      <w:r>
-        <w:rPr>
-          <w:rFonts w:ascii="Calibri" w:cs="Calibri" w:eastAsia="Calibri" w:hAnsi="Calibri"/>
-        </w:rPr>
-        <w:t xml:space="preserve">Group decision-making (not individual risk-taking) is its own distinct human-factors story — a group of experienced people can still make a catastrophic collective decision (groupthink, one person triggering a slide that catches several others).</w:t>
-      </w:r>
-    </w:p>
-    <w:p>
-      <w:pPr>
-        <w:spacing w:after="160"/>
-      </w:pPr>
-      <w:r>
-        <w:rPr>
-          <w:rFonts w:ascii="Calibri" w:cs="Calibri" w:eastAsia="Calibri" w:hAnsi="Calibri"/>
-          <w:b/>
-          <w:bCs/>
-        </w:rPr>
-        <w:t xml:space="preserve">Supports it: </w:t>
-      </w:r>
-      <w:r>
-        <w:rPr>
-          <w:rFonts w:ascii="Consolas" w:cs="Consolas" w:eastAsia="Consolas" w:hAnsi="Consolas"/>
-          <w:sz w:val="20"/>
-          <w:szCs w:val="20"/>
-          <w:shd w:fill="F0F0F0"/>
+        <w:t xml:space="preserve">Question:</w:t>
+      </w:r>
+      <w:r>
+        <w:rPr>
+          <w:rFonts w:ascii="Calibri" w:cs="Calibri" w:eastAsia="Calibri" w:hAnsi="Calibri"/>
+        </w:rPr>
+        <w:t xml:space="preserve"> How often does a single avalanche kill more than one person, and what distinguishes those group-loss events from single-fatality ones?</w:t>
+      </w:r>
+    </w:p>
+    <w:p>
+      <w:pPr>
+        <w:spacing w:after="160"/>
+      </w:pPr>
+      <w:r>
+        <w:rPr>
+          <w:rFonts w:ascii="Calibri" w:cs="Calibri" w:eastAsia="Calibri" w:hAnsi="Calibri"/>
+          <w:b/>
+          <w:bCs/>
+        </w:rPr>
+        <w:t xml:space="preserve">Why it matters:</w:t>
+      </w:r>
+      <w:r>
+        <w:rPr>
+          <w:rFonts w:ascii="Calibri" w:cs="Calibri" w:eastAsia="Calibri" w:hAnsi="Calibri"/>
+        </w:rPr>
+        <w:t xml:space="preserve"> Group decision-making (not individual risk-taking) is its own distinct human-factors story — a group of experienced people can still make a catastrophic collective decision (groupthink, one person triggering a slide that catches several others).</w:t>
+      </w:r>
+    </w:p>
+    <w:p>
+      <w:pPr>
+        <w:spacing w:after="160"/>
+      </w:pPr>
+      <w:r>
+        <w:rPr>
+          <w:rFonts w:ascii="Calibri" w:cs="Calibri" w:eastAsia="Calibri" w:hAnsi="Calibri"/>
+          <w:b/>
+          <w:bCs/>
+        </w:rPr>
+        <w:t xml:space="preserve">Supports it:</w:t>
+      </w:r>
+      <w:r>
+        <w:rPr>
+          <w:rFonts w:ascii="Calibri" w:cs="Calibri" w:eastAsia="Calibri" w:hAnsi="Calibri"/>
+        </w:rPr>
+        <w:t xml:space="preserve"> </w:t>
+      </w:r>
+      <w:r>
+        <w:rPr>
+          <w:rFonts w:ascii="Consolas" w:cs="Consolas" w:eastAsia="Consolas" w:hAnsi="Consolas"/>
+          <w:sz w:val="20"/>
+          <w:szCs w:val="20"/>
+          <w:shd w:fill="F0F0F0" w:val="clear"/>
         </w:rPr>
         <w:t xml:space="preserve">Killed</w:t>
       </w:r>
@@ -1326,7 +1430,7 @@
           <w:rFonts w:ascii="Consolas" w:cs="Consolas" w:eastAsia="Consolas" w:hAnsi="Consolas"/>
           <w:sz w:val="20"/>
           <w:szCs w:val="20"/>
-          <w:shd w:fill="F0F0F0"/>
+          <w:shd w:fill="F0F0F0" w:val="clear"/>
         </w:rPr>
         <w:t xml:space="preserve">PeopleCaught</w:t>
       </w:r>
@@ -1341,7 +1445,7 @@
           <w:rFonts w:ascii="Consolas" w:cs="Consolas" w:eastAsia="Consolas" w:hAnsi="Consolas"/>
           <w:sz w:val="20"/>
           <w:szCs w:val="20"/>
-          <w:shd w:fill="F0F0F0"/>
+          <w:shd w:fill="F0F0F0" w:val="clear"/>
         </w:rPr>
         <w:t xml:space="preserve">PeopleCaughtParsed</w:t>
       </w:r>
@@ -1356,7 +1460,7 @@
           <w:rFonts w:ascii="Consolas" w:cs="Consolas" w:eastAsia="Consolas" w:hAnsi="Consolas"/>
           <w:sz w:val="20"/>
           <w:szCs w:val="20"/>
-          <w:shd w:fill="F0F0F0"/>
+          <w:shd w:fill="F0F0F0" w:val="clear"/>
         </w:rPr>
         <w:t xml:space="preserve">FatalityGroupSize</w:t>
       </w:r>
@@ -1371,7 +1475,7 @@
           <w:rFonts w:ascii="Consolas" w:cs="Consolas" w:eastAsia="Consolas" w:hAnsi="Consolas"/>
           <w:sz w:val="20"/>
           <w:szCs w:val="20"/>
-          <w:shd w:fill="F0F0F0"/>
+          <w:shd w:fill="F0F0F0" w:val="clear"/>
         </w:rPr>
         <w:t xml:space="preserve">Killed</w:t>
       </w:r>
@@ -1386,7 +1490,7 @@
           <w:rFonts w:ascii="Consolas" w:cs="Consolas" w:eastAsia="Consolas" w:hAnsi="Consolas"/>
           <w:sz w:val="20"/>
           <w:szCs w:val="20"/>
-          <w:shd w:fill="F0F0F0"/>
+          <w:shd w:fill="F0F0F0" w:val="clear"/>
         </w:rPr>
         <w:t xml:space="preserve">ActivityCategory</w:t>
       </w:r>
@@ -1407,20 +1511,20 @@
           <w:b/>
           <w:bCs/>
         </w:rPr>
-        <w:t xml:space="preserve">Status: Done. </w:t>
-      </w:r>
-      <w:r>
-        <w:rPr>
-          <w:rFonts w:ascii="Calibri" w:cs="Calibri" w:eastAsia="Calibri" w:hAnsi="Calibri"/>
-        </w:rPr>
-        <w:t xml:space="preserve">Built as a page (</w:t>
-      </w:r>
-      <w:r>
-        <w:rPr>
-          <w:rFonts w:ascii="Consolas" w:cs="Consolas" w:eastAsia="Consolas" w:hAnsi="Consolas"/>
-          <w:sz w:val="20"/>
-          <w:szCs w:val="20"/>
-          <w:shd w:fill="F0F0F0"/>
+        <w:t xml:space="preserve">Status: Done.</w:t>
+      </w:r>
+      <w:r>
+        <w:rPr>
+          <w:rFonts w:ascii="Calibri" w:cs="Calibri" w:eastAsia="Calibri" w:hAnsi="Calibri"/>
+        </w:rPr>
+        <w:t xml:space="preserve"> Built as a page (</w:t>
+      </w:r>
+      <w:r>
+        <w:rPr>
+          <w:rFonts w:ascii="Consolas" w:cs="Consolas" w:eastAsia="Consolas" w:hAnsi="Consolas"/>
+          <w:sz w:val="20"/>
+          <w:szCs w:val="20"/>
+          <w:shd w:fill="F0F0F0" w:val="clear"/>
         </w:rPr>
         <w:t xml:space="preserve">Q4</w:t>
       </w:r>
@@ -1435,7 +1539,7 @@
           <w:rFonts w:ascii="Consolas" w:cs="Consolas" w:eastAsia="Consolas" w:hAnsi="Consolas"/>
           <w:sz w:val="20"/>
           <w:szCs w:val="20"/>
-          <w:shd w:fill="F0F0F0"/>
+          <w:shd w:fill="F0F0F0" w:val="clear"/>
         </w:rPr>
         <w:t xml:space="preserve">% Multi-Fatality Events</w:t>
       </w:r>
@@ -1450,7 +1554,7 @@
           <w:rFonts w:ascii="Consolas" w:cs="Consolas" w:eastAsia="Consolas" w:hAnsi="Consolas"/>
           <w:sz w:val="20"/>
           <w:szCs w:val="20"/>
-          <w:shd w:fill="F0F0F0"/>
+          <w:shd w:fill="F0F0F0" w:val="clear"/>
         </w:rPr>
         <w:t xml:space="preserve">ActivityCategory</w:t>
       </w:r>
@@ -1458,14 +1562,14 @@
         <w:rPr>
           <w:rFonts w:ascii="Calibri" w:cs="Calibri" w:eastAsia="Calibri" w:hAnsi="Calibri"/>
         </w:rPr>
-        <w:t xml:space="preserve">, and a severity-comparison table (</w:t>
-      </w:r>
-      <w:r>
-        <w:rPr>
-          <w:rFonts w:ascii="Consolas" w:cs="Consolas" w:eastAsia="Consolas" w:hAnsi="Consolas"/>
-          <w:sz w:val="20"/>
-          <w:szCs w:val="20"/>
-          <w:shd w:fill="F0F0F0"/>
+        <w:t xml:space="preserve">, and a severity- comparison table (</w:t>
+      </w:r>
+      <w:r>
+        <w:rPr>
+          <w:rFonts w:ascii="Consolas" w:cs="Consolas" w:eastAsia="Consolas" w:hAnsi="Consolas"/>
+          <w:sz w:val="20"/>
+          <w:szCs w:val="20"/>
+          <w:shd w:fill="F0F0F0" w:val="clear"/>
         </w:rPr>
         <w:t xml:space="preserve">FatalityGroupSize</w:t>
       </w:r>
@@ -1480,7 +1584,7 @@
           <w:rFonts w:ascii="Consolas" w:cs="Consolas" w:eastAsia="Consolas" w:hAnsi="Consolas"/>
           <w:sz w:val="20"/>
           <w:szCs w:val="20"/>
-          <w:shd w:fill="F0F0F0"/>
+          <w:shd w:fill="F0F0F0" w:val="clear"/>
         </w:rPr>
         <w:t xml:space="preserve">Modern Parsed Events</w:t>
       </w:r>
@@ -1495,7 +1599,7 @@
           <w:rFonts w:ascii="Consolas" w:cs="Consolas" w:eastAsia="Consolas" w:hAnsi="Consolas"/>
           <w:sz w:val="20"/>
           <w:szCs w:val="20"/>
-          <w:shd w:fill="F0F0F0"/>
+          <w:shd w:fill="F0F0F0" w:val="clear"/>
         </w:rPr>
         <w:t xml:space="preserve">Avg People Caught (Modern)</w:t>
       </w:r>
@@ -1510,7 +1614,7 @@
           <w:rFonts w:ascii="Consolas" w:cs="Consolas" w:eastAsia="Consolas" w:hAnsi="Consolas"/>
           <w:sz w:val="20"/>
           <w:szCs w:val="20"/>
-          <w:shd w:fill="F0F0F0"/>
+          <w:shd w:fill="F0F0F0" w:val="clear"/>
         </w:rPr>
         <w:t xml:space="preserve">Avg Killed (Modern, Parsed)</w:t>
       </w:r>
@@ -1525,7 +1629,7 @@
           <w:rFonts w:ascii="Consolas" w:cs="Consolas" w:eastAsia="Consolas" w:hAnsi="Consolas"/>
           <w:sz w:val="20"/>
           <w:szCs w:val="20"/>
-          <w:shd w:fill="F0F0F0"/>
+          <w:shd w:fill="F0F0F0" w:val="clear"/>
         </w:rPr>
         <w:t xml:space="preserve">Survival Rate (Modern)</w:t>
       </w:r>
@@ -1540,7 +1644,7 @@
           <w:rFonts w:ascii="Consolas" w:cs="Consolas" w:eastAsia="Consolas" w:hAnsi="Consolas"/>
           <w:sz w:val="20"/>
           <w:szCs w:val="20"/>
-          <w:shd w:fill="F0F0F0"/>
+          <w:shd w:fill="F0F0F0" w:val="clear"/>
         </w:rPr>
         <w:t xml:space="preserve">FatalityGroupSize</w:t>
       </w:r>
@@ -1555,7 +1659,7 @@
           <w:rFonts w:ascii="Consolas" w:cs="Consolas" w:eastAsia="Consolas" w:hAnsi="Consolas"/>
           <w:sz w:val="20"/>
           <w:szCs w:val="20"/>
-          <w:shd w:fill="F0F0F0"/>
+          <w:shd w:fill="F0F0F0" w:val="clear"/>
         </w:rPr>
         <w:t xml:space="preserve">Killed</w:t>
       </w:r>
@@ -1570,7 +1674,7 @@
           <w:rFonts w:ascii="Consolas" w:cs="Consolas" w:eastAsia="Consolas" w:hAnsi="Consolas"/>
           <w:sz w:val="20"/>
           <w:szCs w:val="20"/>
-          <w:shd w:fill="F0F0F0"/>
+          <w:shd w:fill="F0F0F0" w:val="clear"/>
         </w:rPr>
         <w:t xml:space="preserve">Single-fatality (1)</w:t>
       </w:r>
@@ -1585,7 +1689,7 @@
           <w:rFonts w:ascii="Consolas" w:cs="Consolas" w:eastAsia="Consolas" w:hAnsi="Consolas"/>
           <w:sz w:val="20"/>
           <w:szCs w:val="20"/>
-          <w:shd w:fill="F0F0F0"/>
+          <w:shd w:fill="F0F0F0" w:val="clear"/>
         </w:rPr>
         <w:t xml:space="preserve">Multi-Fatality (2+)</w:t>
       </w:r>
@@ -1600,7 +1704,7 @@
           <w:rFonts w:ascii="Consolas" w:cs="Consolas" w:eastAsia="Consolas" w:hAnsi="Consolas"/>
           <w:sz w:val="20"/>
           <w:szCs w:val="20"/>
-          <w:shd w:fill="F0F0F0"/>
+          <w:shd w:fill="F0F0F0" w:val="clear"/>
         </w:rPr>
         <w:t xml:space="preserve">Region</w:t>
       </w:r>
@@ -1621,20 +1725,20 @@
           <w:b/>
           <w:bCs/>
         </w:rPr>
-        <w:t xml:space="preserve">Build note: </w:t>
-      </w:r>
-      <w:r>
-        <w:rPr>
-          <w:rFonts w:ascii="Calibri" w:cs="Calibri" w:eastAsia="Calibri" w:hAnsi="Calibri"/>
-        </w:rPr>
-        <w:t xml:space="preserve">the </w:t>
-      </w:r>
-      <w:r>
-        <w:rPr>
-          <w:rFonts w:ascii="Consolas" w:cs="Consolas" w:eastAsia="Consolas" w:hAnsi="Consolas"/>
-          <w:sz w:val="20"/>
-          <w:szCs w:val="20"/>
-          <w:shd w:fill="F0F0F0"/>
+        <w:t xml:space="preserve">Build note:</w:t>
+      </w:r>
+      <w:r>
+        <w:rPr>
+          <w:rFonts w:ascii="Calibri" w:cs="Calibri" w:eastAsia="Calibri" w:hAnsi="Calibri"/>
+        </w:rPr>
+        <w:t xml:space="preserve"> the </w:t>
+      </w:r>
+      <w:r>
+        <w:rPr>
+          <w:rFonts w:ascii="Consolas" w:cs="Consolas" w:eastAsia="Consolas" w:hAnsi="Consolas"/>
+          <w:sz w:val="20"/>
+          <w:szCs w:val="20"/>
+          <w:shd w:fill="F0F0F0" w:val="clear"/>
         </w:rPr>
         <w:t xml:space="preserve">AvyYear</w:t>
       </w:r>
@@ -1649,7 +1753,7 @@
           <w:rFonts w:ascii="Consolas" w:cs="Consolas" w:eastAsia="Consolas" w:hAnsi="Consolas"/>
           <w:sz w:val="20"/>
           <w:szCs w:val="20"/>
-          <w:shd w:fill="F0F0F0"/>
+          <w:shd w:fill="F0F0F0" w:val="clear"/>
         </w:rPr>
         <w:t xml:space="preserve">AvyYear &gt;= 2013</w:t>
       </w:r>
@@ -1657,14 +1761,14 @@
         <w:rPr>
           <w:rFonts w:ascii="Calibri" w:cs="Calibri" w:eastAsia="Calibri" w:hAnsi="Calibri"/>
         </w:rPr>
-        <w:t xml:space="preserve">), which threw a “DAX comparison operations do not support comparing values of type Text with values of type Integer” error. Existing charts never hit this because none of them did a raw row-level numeric comparison against </w:t>
-      </w:r>
-      <w:r>
-        <w:rPr>
-          <w:rFonts w:ascii="Consolas" w:cs="Consolas" w:eastAsia="Consolas" w:hAnsi="Consolas"/>
-          <w:sz w:val="20"/>
-          <w:szCs w:val="20"/>
-          <w:shd w:fill="F0F0F0"/>
+        <w:t xml:space="preserve">), which threw a "DAX comparison operations do not support comparing values of type Text with values of type Integer" error. Existing charts never hit this because none of them did a raw row-level numeric comparison against </w:t>
+      </w:r>
+      <w:r>
+        <w:rPr>
+          <w:rFonts w:ascii="Consolas" w:cs="Consolas" w:eastAsia="Consolas" w:hAnsi="Consolas"/>
+          <w:sz w:val="20"/>
+          <w:szCs w:val="20"/>
+          <w:shd w:fill="F0F0F0" w:val="clear"/>
         </w:rPr>
         <w:t xml:space="preserve">AvyYear</w:t>
       </w:r>
@@ -1672,14 +1776,29 @@
         <w:rPr>
           <w:rFonts w:ascii="Calibri" w:cs="Calibri" w:eastAsia="Calibri" w:hAnsi="Calibri"/>
         </w:rPr>
-        <w:t xml:space="preserve"> directly. Fixed by changing the column's Data type to Whole Number directly in Power BI's Data view (mechanical fix, no Python needed). See </w:t>
-      </w:r>
-      <w:r>
-        <w:rPr>
-          <w:rFonts w:ascii="Consolas" w:cs="Consolas" w:eastAsia="Consolas" w:hAnsi="Consolas"/>
-          <w:sz w:val="20"/>
-          <w:szCs w:val="20"/>
-          <w:shd w:fill="F0F0F0"/>
+        <w:t xml:space="preserve"> directly. Fixed by changing the column's Data type to Whole Number directly in Power BI's Data view (mechanical fix, no Python needed). Worth remembering for any future measure that filters on </w:t>
+      </w:r>
+      <w:r>
+        <w:rPr>
+          <w:rFonts w:ascii="Consolas" w:cs="Consolas" w:eastAsia="Consolas" w:hAnsi="Consolas"/>
+          <w:sz w:val="20"/>
+          <w:szCs w:val="20"/>
+          <w:shd w:fill="F0F0F0" w:val="clear"/>
+        </w:rPr>
+        <w:t xml:space="preserve">AvyYear</w:t>
+      </w:r>
+      <w:r>
+        <w:rPr>
+          <w:rFonts w:ascii="Calibri" w:cs="Calibri" w:eastAsia="Calibri" w:hAnsi="Calibri"/>
+        </w:rPr>
+        <w:t xml:space="preserve"> a new way — see </w:t>
+      </w:r>
+      <w:r>
+        <w:rPr>
+          <w:rFonts w:ascii="Consolas" w:cs="Consolas" w:eastAsia="Consolas" w:hAnsi="Consolas"/>
+          <w:sz w:val="20"/>
+          <w:szCs w:val="20"/>
+          <w:shd w:fill="F0F0F0" w:val="clear"/>
         </w:rPr>
         <w:t xml:space="preserve">fact_table_data_dictionary.md</w:t>
       </w:r>
@@ -1700,20 +1819,20 @@
           <w:b/>
           <w:bCs/>
         </w:rPr>
-        <w:t xml:space="preserve">Caveats to carry onto the page: </w:t>
-      </w:r>
-      <w:r>
-        <w:rPr>
-          <w:rFonts w:ascii="Calibri" w:cs="Calibri" w:eastAsia="Calibri" w:hAnsi="Calibri"/>
-        </w:rPr>
-        <w:t xml:space="preserve">the severity-comparison table is restricted to the 261 modern-era (2013-2025) events with both a description and a valid </w:t>
-      </w:r>
-      <w:r>
-        <w:rPr>
-          <w:rFonts w:ascii="Consolas" w:cs="Consolas" w:eastAsia="Consolas" w:hAnsi="Consolas"/>
-          <w:sz w:val="20"/>
-          <w:szCs w:val="20"/>
-          <w:shd w:fill="F0F0F0"/>
+        <w:t xml:space="preserve">Caveats to carry onto the page:</w:t>
+      </w:r>
+      <w:r>
+        <w:rPr>
+          <w:rFonts w:ascii="Calibri" w:cs="Calibri" w:eastAsia="Calibri" w:hAnsi="Calibri"/>
+        </w:rPr>
+        <w:t xml:space="preserve"> the severity-comparison table is restricted to the 261 modern-era (2013-2025) events with both a description and a valid </w:t>
+      </w:r>
+      <w:r>
+        <w:rPr>
+          <w:rFonts w:ascii="Consolas" w:cs="Consolas" w:eastAsia="Consolas" w:hAnsi="Consolas"/>
+          <w:sz w:val="20"/>
+          <w:szCs w:val="20"/>
+          <w:shd w:fill="F0F0F0" w:val="clear"/>
         </w:rPr>
         <w:t xml:space="preserve">PeopleCaught</w:t>
       </w:r>
@@ -1728,7 +1847,7 @@
           <w:rFonts w:ascii="Consolas" w:cs="Consolas" w:eastAsia="Consolas" w:hAnsi="Consolas"/>
           <w:sz w:val="20"/>
           <w:szCs w:val="20"/>
-          <w:shd w:fill="F0F0F0"/>
+          <w:shd w:fill="F0F0F0" w:val="clear"/>
         </w:rPr>
         <w:t xml:space="preserve">PrimaryActivity</w:t>
       </w:r>
@@ -1738,14 +1857,6 @@
         </w:rPr>
         <w:t xml:space="preserve"> reflects individual investigator judgment, not a standardized taxonomy applied consistently across 75 years.</w:t>
       </w:r>
-    </w:p>
-    <w:p>
-      <w:pPr>
-        <w:pBdr>
-          <w:bottom w:val="single" w:color="AAAAAA" w:sz="6" w:space="1"/>
-        </w:pBdr>
-        <w:spacing w:after="240" w:before="120"/>
-      </w:pPr>
     </w:p>
     <w:p>
       <w:pPr>
@@ -1766,52 +1877,58 @@
           <w:b/>
           <w:bCs/>
         </w:rPr>
-        <w:t xml:space="preserve">Question: </w:t>
-      </w:r>
-      <w:r>
-        <w:rPr>
-          <w:rFonts w:ascii="Calibri" w:cs="Calibri" w:eastAsia="Calibri" w:hAnsi="Calibri"/>
-        </w:rPr>
-        <w:t xml:space="preserve">Does CAIC website engagement — used here as a proxy for how many people are preparing before heading into the backcountry, not a headcount of participants — show a rising trend over FY2015-16 through FY2024-25, and do Colorado avalanche fatalities show any corresponding trend against it?</w:t>
-      </w:r>
-    </w:p>
-    <w:p>
-      <w:pPr>
-        <w:spacing w:after="160"/>
-      </w:pPr>
-      <w:r>
-        <w:rPr>
-          <w:rFonts w:ascii="Calibri" w:cs="Calibri" w:eastAsia="Calibri" w:hAnsi="Calibri"/>
-          <w:b/>
-          <w:bCs/>
-        </w:rPr>
-        <w:t xml:space="preserve">Why it matters: </w:t>
-      </w:r>
-      <w:r>
-        <w:rPr>
-          <w:rFonts w:ascii="Calibri" w:cs="Calibri" w:eastAsia="Calibri" w:hAnsi="Calibri"/>
-        </w:rPr>
-        <w:t xml:space="preserve">This is the question that started the whole project: is backcountry travel actually becoming safer as gear, forecasting tools, and avalanche education have improved? Added mid-project, once it was clear the other four questions wouldn't get to it on their own. Research turned up no clean, continuous, publicly available time series of backcountry participation or safety-equipment/education adoption — what exists is scattered industry press-release snapshots (SIA/SFIA) with inconsistent year-to-year definitions, and even peer-reviewed research using CAIC's own accident data (Niemann et al., 2022) had to drop an avalanche-education variable entirely due to 78% missing data. CAIC's own website/app engagement numbers are the best available substitute: same organization, same years, directly comparable to the fatality data already on this dashboard, and tied to Tremper's “check the forecast before you go” risk-reduction framing already central to this project's citations.</w:t>
-      </w:r>
-    </w:p>
-    <w:p>
-      <w:pPr>
-        <w:spacing w:after="160"/>
-      </w:pPr>
-      <w:r>
-        <w:rPr>
-          <w:rFonts w:ascii="Calibri" w:cs="Calibri" w:eastAsia="Calibri" w:hAnsi="Calibri"/>
-          <w:b/>
-          <w:bCs/>
-        </w:rPr>
-        <w:t xml:space="preserve">Supports it: </w:t>
-      </w:r>
-      <w:r>
-        <w:rPr>
-          <w:rFonts w:ascii="Consolas" w:cs="Consolas" w:eastAsia="Consolas" w:hAnsi="Consolas"/>
-          <w:sz w:val="20"/>
-          <w:szCs w:val="20"/>
-          <w:shd w:fill="F0F0F0"/>
+        <w:t xml:space="preserve">Question:</w:t>
+      </w:r>
+      <w:r>
+        <w:rPr>
+          <w:rFonts w:ascii="Calibri" w:cs="Calibri" w:eastAsia="Calibri" w:hAnsi="Calibri"/>
+        </w:rPr>
+        <w:t xml:space="preserve"> Does CAIC website engagement — used here as a proxy for how many people are preparing before heading into the backcountry, not a headcount of participants — show a rising trend over FY2015-16 through FY2024-25, and do Colorado avalanche fatalities show any corresponding trend against it?</w:t>
+      </w:r>
+    </w:p>
+    <w:p>
+      <w:pPr>
+        <w:spacing w:after="160"/>
+      </w:pPr>
+      <w:r>
+        <w:rPr>
+          <w:rFonts w:ascii="Calibri" w:cs="Calibri" w:eastAsia="Calibri" w:hAnsi="Calibri"/>
+          <w:b/>
+          <w:bCs/>
+        </w:rPr>
+        <w:t xml:space="preserve">Why it matters:</w:t>
+      </w:r>
+      <w:r>
+        <w:rPr>
+          <w:rFonts w:ascii="Calibri" w:cs="Calibri" w:eastAsia="Calibri" w:hAnsi="Calibri"/>
+        </w:rPr>
+        <w:t xml:space="preserve"> This is the question that started the whole project: is backcountry travel actually becoming safer as gear, forecasting tools, and avalanche education have improved? Added mid-project, once it was clear the other four questions wouldn't get to it on their own. Research turned up no clean, continuous, publicly available time series of backcountry participation or safety-equipment/education adoption — what exists is scattered industry press-release snapshots (SIA/SFIA) with inconsistent year-to-year definitions, and even peer-reviewed research using CAIC's own accident data (Niemann et al., 2022) had to drop an avalanche-education variable entirely due to 78% missing data. CAIC's own website/app engagement numbers are the best available substitute: same organization, same years, directly comparable to the fatality data already on this dashboard, and tied to Tremper's "check the forecast before you go" risk-reduction framing already central to this project's citations.</w:t>
+      </w:r>
+    </w:p>
+    <w:p>
+      <w:pPr>
+        <w:spacing w:after="160"/>
+      </w:pPr>
+      <w:r>
+        <w:rPr>
+          <w:rFonts w:ascii="Calibri" w:cs="Calibri" w:eastAsia="Calibri" w:hAnsi="Calibri"/>
+          <w:b/>
+          <w:bCs/>
+        </w:rPr>
+        <w:t xml:space="preserve">Supports it:</w:t>
+      </w:r>
+      <w:r>
+        <w:rPr>
+          <w:rFonts w:ascii="Calibri" w:cs="Calibri" w:eastAsia="Calibri" w:hAnsi="Calibri"/>
+        </w:rPr>
+        <w:t xml:space="preserve"> </w:t>
+      </w:r>
+      <w:r>
+        <w:rPr>
+          <w:rFonts w:ascii="Consolas" w:cs="Consolas" w:eastAsia="Consolas" w:hAnsi="Consolas"/>
+          <w:sz w:val="20"/>
+          <w:szCs w:val="20"/>
+          <w:shd w:fill="F0F0F0" w:val="clear"/>
         </w:rPr>
         <w:t xml:space="preserve">caic_engagement_by_year</w:t>
       </w:r>
@@ -1826,7 +1943,7 @@
           <w:rFonts w:ascii="Consolas" w:cs="Consolas" w:eastAsia="Consolas" w:hAnsi="Consolas"/>
           <w:sz w:val="20"/>
           <w:szCs w:val="20"/>
-          <w:shd w:fill="F0F0F0"/>
+          <w:shd w:fill="F0F0F0" w:val="clear"/>
         </w:rPr>
         <w:t xml:space="preserve">Website Value Clean</w:t>
       </w:r>
@@ -1841,7 +1958,7 @@
           <w:rFonts w:ascii="Consolas" w:cs="Consolas" w:eastAsia="Consolas" w:hAnsi="Consolas"/>
           <w:sz w:val="20"/>
           <w:szCs w:val="20"/>
-          <w:shd w:fill="F0F0F0"/>
+          <w:shd w:fill="F0F0F0" w:val="clear"/>
         </w:rPr>
         <w:t xml:space="preserve">fatalities_accident_db</w:t>
       </w:r>
@@ -1849,33 +1966,33 @@
         <w:rPr>
           <w:rFonts w:ascii="Calibri" w:cs="Calibri" w:eastAsia="Calibri" w:hAnsi="Calibri"/>
         </w:rPr>
-        <w:t xml:space="preserve"> (Colorado fatality count, cross-validated against the main accident database).</w:t>
-      </w:r>
-    </w:p>
-    <w:p>
-      <w:pPr>
-        <w:spacing w:after="160"/>
-      </w:pPr>
-      <w:r>
-        <w:rPr>
-          <w:rFonts w:ascii="Calibri" w:cs="Calibri" w:eastAsia="Calibri" w:hAnsi="Calibri"/>
-          <w:b/>
-          <w:bCs/>
-        </w:rPr>
-        <w:t xml:space="preserve">Status: Done. </w:t>
-      </w:r>
-      <w:r>
-        <w:rPr>
-          <w:rFonts w:ascii="Calibri" w:cs="Calibri" w:eastAsia="Calibri" w:hAnsi="Calibri"/>
-        </w:rPr>
-        <w:t xml:space="preserve">Built as a page with a dual-axis combo chart: engagement (</w:t>
-      </w:r>
-      <w:r>
-        <w:rPr>
-          <w:rFonts w:ascii="Consolas" w:cs="Consolas" w:eastAsia="Consolas" w:hAnsi="Consolas"/>
-          <w:sz w:val="20"/>
-          <w:szCs w:val="20"/>
-          <w:shd w:fill="F0F0F0"/>
+        <w:t xml:space="preserve"> (Colorado fatality count, cross- validated against the main accident database).</w:t>
+      </w:r>
+    </w:p>
+    <w:p>
+      <w:pPr>
+        <w:spacing w:after="160"/>
+      </w:pPr>
+      <w:r>
+        <w:rPr>
+          <w:rFonts w:ascii="Calibri" w:cs="Calibri" w:eastAsia="Calibri" w:hAnsi="Calibri"/>
+          <w:b/>
+          <w:bCs/>
+        </w:rPr>
+        <w:t xml:space="preserve">Status: Done.</w:t>
+      </w:r>
+      <w:r>
+        <w:rPr>
+          <w:rFonts w:ascii="Calibri" w:cs="Calibri" w:eastAsia="Calibri" w:hAnsi="Calibri"/>
+        </w:rPr>
+        <w:t xml:space="preserve"> Built as a page with a dual-axis combo chart: engagement (</w:t>
+      </w:r>
+      <w:r>
+        <w:rPr>
+          <w:rFonts w:ascii="Consolas" w:cs="Consolas" w:eastAsia="Consolas" w:hAnsi="Consolas"/>
+          <w:sz w:val="20"/>
+          <w:szCs w:val="20"/>
+          <w:shd w:fill="F0F0F0" w:val="clear"/>
         </w:rPr>
         <w:t xml:space="preserve">Website Value Clean</w:t>
       </w:r>
@@ -1890,7 +2007,7 @@
           <w:rFonts w:ascii="Consolas" w:cs="Consolas" w:eastAsia="Consolas" w:hAnsi="Consolas"/>
           <w:sz w:val="20"/>
           <w:szCs w:val="20"/>
-          <w:shd w:fill="F0F0F0"/>
+          <w:shd w:fill="F0F0F0" w:val="clear"/>
         </w:rPr>
         <w:t xml:space="preserve">avy_year</w:t>
       </w:r>
@@ -1898,52 +2015,112 @@
         <w:rPr>
           <w:rFonts w:ascii="Calibri" w:cs="Calibri" w:eastAsia="Calibri" w:hAnsi="Calibri"/>
         </w:rPr>
-        <w:t xml:space="preserve">. Recomputed independently in Python against the canonical CSV before documenting (project convention — see Q4 and the appendix for the same cross-check habit) — and this cross-check caught a real error in an earlier draft of this write-up, worth recording as its own small lesson: engagement has a real upward trend against year (r≈0.57, excluding the flagged FY16-17 value), rising roughly 40% comparing the first three valid years' average (FY15-16–FY18-19, ≈1.95M) to the most recent three (FY22-23–FY24-25, ≈2.74M). Fatalities show almost no relationship to year over the same span (r≈0.16) — an earlier pass at this number wrongly excluded FY16-17 from the fatalities series too (that year's fatality count isn't suspect, only its website figure is), which artificially flattened the correlation to r≈-0.03. Keeping all 10 years for fatalities and only excluding the flagged year from the engagement series gives the correct r≈0.16 — still a weak relationship, still governed mostly by each season's snowpack rather than by engagement's rise, just not quite as flat as the earlier miscalculation suggested.</w:t>
-      </w:r>
-    </w:p>
-    <w:p>
-      <w:pPr>
-        <w:spacing w:after="160"/>
-      </w:pPr>
-      <w:r>
-        <w:rPr>
-          <w:rFonts w:ascii="Calibri" w:cs="Calibri" w:eastAsia="Calibri" w:hAnsi="Calibri"/>
-          <w:b/>
-          <w:bCs/>
-        </w:rPr>
-        <w:t xml:space="preserve">Finding, as written on the page: </w:t>
-      </w:r>
-      <w:r>
-        <w:rPr>
-          <w:rFonts w:ascii="Calibri" w:cs="Calibri" w:eastAsia="Calibri" w:hAnsi="Calibri"/>
-        </w:rPr>
-        <w:t xml:space="preserve">“Website engagement and Colorado fatalities move largely independently of each other over this decade. Engagement has a real upward relationship with time (moderate positive correlation, r ≈ 0.57, excluding the flagged FY16-17 value): roughly 40% higher in the most recent three years than the first three. Fatalities show almost no relationship to time at all (r ≈ 0.16), bouncing up and down mainly with how dangerous each season's snowpack was rather than tracking engagement. That pattern fits with the idea that as more people prepare for backcountry trips, risk per person is going down, even though we can't say for sure why — better gear, more education, and more cautious decisions could all be playing a part.”</w:t>
-      </w:r>
-    </w:p>
-    <w:p>
-      <w:pPr>
-        <w:spacing w:after="160"/>
-      </w:pPr>
-      <w:r>
-        <w:rPr>
-          <w:rFonts w:ascii="Calibri" w:cs="Calibri" w:eastAsia="Calibri" w:hAnsi="Calibri"/>
-          <w:b/>
-          <w:bCs/>
-        </w:rPr>
-        <w:t xml:space="preserve">Build note: </w:t>
-      </w:r>
-      <w:r>
-        <w:rPr>
-          <w:rFonts w:ascii="Calibri" w:cs="Calibri" w:eastAsia="Calibri" w:hAnsi="Calibri"/>
-        </w:rPr>
-        <w:t xml:space="preserve">the duplicate FY16-17 website figure (see </w:t>
-      </w:r>
-      <w:r>
-        <w:rPr>
-          <w:rFonts w:ascii="Consolas" w:cs="Consolas" w:eastAsia="Consolas" w:hAnsi="Consolas"/>
-          <w:sz w:val="20"/>
-          <w:szCs w:val="20"/>
-          <w:shd w:fill="F0F0F0"/>
+        <w:t xml:space="preserve">. Recomputed independently in Python against the canonical CSV before documenting (project convention — see Q4 and the appendix for the same cross-check habit) — and this cross-check caught a real error in an earlier draft of this write-up, worth recording as its own small lesson: engagement has a real upward trend against year (r≈0.57, excluding the flagged FY16-17 value), rising ≈41% comparing the first three valid years' average (FY15-16–FY18-19, ≈1.95M) to the most recent three (FY22-23–FY24-25, ≈2.74M) — the dashboard's "Website Engagement Growth Since 2016" KPI shows the same figure, rounded to +41%. Fatalities show almost no relationship to year over the same span (r≈0.16) — an earlier pass at this number wrongly excluded FY16-17 from the *fatalities* series too (that year's fatality count isn't suspect, only its website figure is), which artificially flattened the correlation to r≈-0.03. Keeping all 10 years for fatalities and only excluding the flagged year from the engagement series gives the correct r≈0.16 — still a weak relationship, still governed mostly by each season's snowpack rather than by engagement's rise, just not quite as flat as the earlier miscalculation suggested.</w:t>
+      </w:r>
+    </w:p>
+    <w:p>
+      <w:pPr>
+        <w:spacing w:after="160"/>
+      </w:pPr>
+      <w:r>
+        <w:rPr>
+          <w:rFonts w:ascii="Calibri" w:cs="Calibri" w:eastAsia="Calibri" w:hAnsi="Calibri"/>
+          <w:b/>
+          <w:bCs/>
+        </w:rPr>
+        <w:t xml:space="preserve">Finding, as written on the page:</w:t>
+      </w:r>
+      <w:r>
+        <w:rPr>
+          <w:rFonts w:ascii="Calibri" w:cs="Calibri" w:eastAsia="Calibri" w:hAnsi="Calibri"/>
+        </w:rPr>
+        <w:t xml:space="preserve"> the KPI row shows four cards (</w:t>
+      </w:r>
+      <w:r>
+        <w:rPr>
+          <w:rFonts w:ascii="Consolas" w:cs="Consolas" w:eastAsia="Consolas" w:hAnsi="Consolas"/>
+          <w:sz w:val="20"/>
+          <w:szCs w:val="20"/>
+          <w:shd w:fill="F0F0F0" w:val="clear"/>
+        </w:rPr>
+        <w:t xml:space="preserve">Avg CO Fatalities Per Season</w:t>
+      </w:r>
+      <w:r>
+        <w:rPr>
+          <w:rFonts w:ascii="Calibri" w:cs="Calibri" w:eastAsia="Calibri" w:hAnsi="Calibri"/>
+        </w:rPr>
+        <w:t xml:space="preserve">: 5.80, </w:t>
+      </w:r>
+      <w:r>
+        <w:rPr>
+          <w:rFonts w:ascii="Consolas" w:cs="Consolas" w:eastAsia="Consolas" w:hAnsi="Consolas"/>
+          <w:sz w:val="20"/>
+          <w:szCs w:val="20"/>
+          <w:shd w:fill="F0F0F0" w:val="clear"/>
+        </w:rPr>
+        <w:t xml:space="preserve">Website Engagement Growth Since 2016</w:t>
+      </w:r>
+      <w:r>
+        <w:rPr>
+          <w:rFonts w:ascii="Calibri" w:cs="Calibri" w:eastAsia="Calibri" w:hAnsi="Calibri"/>
+        </w:rPr>
+        <w:t xml:space="preserve">: +41%, </w:t>
+      </w:r>
+      <w:r>
+        <w:rPr>
+          <w:rFonts w:ascii="Consolas" w:cs="Consolas" w:eastAsia="Consolas" w:hAnsi="Consolas"/>
+          <w:sz w:val="20"/>
+          <w:szCs w:val="20"/>
+          <w:shd w:fill="F0F0F0" w:val="clear"/>
+        </w:rPr>
+        <w:t xml:space="preserve">Correlation With Engagement</w:t>
+      </w:r>
+      <w:r>
+        <w:rPr>
+          <w:rFonts w:ascii="Calibri" w:cs="Calibri" w:eastAsia="Calibri" w:hAnsi="Calibri"/>
+        </w:rPr>
+        <w:t xml:space="preserve">: "Moderate Upward Trend" with "r ~ 0.57 vs. year" as supporting detail, </w:t>
+      </w:r>
+      <w:r>
+        <w:rPr>
+          <w:rFonts w:ascii="Consolas" w:cs="Consolas" w:eastAsia="Consolas" w:hAnsi="Consolas"/>
+          <w:sz w:val="20"/>
+          <w:szCs w:val="20"/>
+          <w:shd w:fill="F0F0F0" w:val="clear"/>
+        </w:rPr>
+        <w:t xml:space="preserve">Correlation With Fatalities</w:t>
+      </w:r>
+      <w:r>
+        <w:rPr>
+          <w:rFonts w:ascii="Calibri" w:cs="Calibri" w:eastAsia="Calibri" w:hAnsi="Calibri"/>
+        </w:rPr>
+        <w:t xml:space="preserve">: "No Meaningful Trend" with "r ~ 0.16 vs. year"). The two correlation cards were deliberately split and given plain-language labels rather than raw r-values, since two unlabeled correlation numbers side by side on a page about engagement-vs-fatalities invited readers to assume they measured the relationship between those two variables directly, when both actually measure each variable's own trend against year. Below the chart: "Fatalities bounce up and down mainly with how dangerous each season's snowpack was, not with engagement. That pattern is consistent with risk per person going down as more people prepare, though we can't say for sure why, whether better gear, more education, or more cautious decisions."</w:t>
+      </w:r>
+    </w:p>
+    <w:p>
+      <w:pPr>
+        <w:spacing w:after="160"/>
+      </w:pPr>
+      <w:r>
+        <w:rPr>
+          <w:rFonts w:ascii="Calibri" w:cs="Calibri" w:eastAsia="Calibri" w:hAnsi="Calibri"/>
+          <w:b/>
+          <w:bCs/>
+        </w:rPr>
+        <w:t xml:space="preserve">Build note:</w:t>
+      </w:r>
+      <w:r>
+        <w:rPr>
+          <w:rFonts w:ascii="Calibri" w:cs="Calibri" w:eastAsia="Calibri" w:hAnsi="Calibri"/>
+        </w:rPr>
+        <w:t xml:space="preserve"> the duplicate FY16-17 website figure (see </w:t>
+      </w:r>
+      <w:r>
+        <w:rPr>
+          <w:rFonts w:ascii="Consolas" w:cs="Consolas" w:eastAsia="Consolas" w:hAnsi="Consolas"/>
+          <w:sz w:val="20"/>
+          <w:szCs w:val="20"/>
+          <w:shd w:fill="F0F0F0" w:val="clear"/>
         </w:rPr>
         <w:t xml:space="preserve">caic_engagement_data_dictionary.md</w:t>
       </w:r>
@@ -1958,7 +2135,7 @@
           <w:rFonts w:ascii="Consolas" w:cs="Consolas" w:eastAsia="Consolas" w:hAnsi="Consolas"/>
           <w:sz w:val="20"/>
           <w:szCs w:val="20"/>
-          <w:shd w:fill="F0F0F0"/>
+          <w:shd w:fill="F0F0F0" w:val="clear"/>
         </w:rPr>
         <w:t xml:space="preserve">Website Value Clean</w:t>
       </w:r>
@@ -1973,7 +2150,7 @@
           <w:rFonts w:ascii="Consolas" w:cs="Consolas" w:eastAsia="Consolas" w:hAnsi="Consolas"/>
           <w:sz w:val="20"/>
           <w:szCs w:val="20"/>
-          <w:shd w:fill="F0F0F0"/>
+          <w:shd w:fill="F0F0F0" w:val="clear"/>
         </w:rPr>
         <w:t xml:space="preserve">IF(website_metric_suspect = TRUE, BLANK(), website_metric_value)</w:t>
       </w:r>
@@ -1994,39 +2171,39 @@
           <w:b/>
           <w:bCs/>
         </w:rPr>
-        <w:t xml:space="preserve">Caveats, as written on the page: </w:t>
-      </w:r>
-      <w:r>
-        <w:rPr>
-          <w:rFonts w:ascii="Calibri" w:cs="Calibri" w:eastAsia="Calibri" w:hAnsi="Calibri"/>
-        </w:rPr>
-        <w:t xml:space="preserve">“This measures engagement with CAIC's safety information, not a literal participant headcount — it can't distinguish one person checking daily from many people checking once, and some traffic is likely storm- or news-driven rather than trip planning. The metric itself changes definition mid-series (website traffic switched from 'visits' to 'pageviews' between FY17 and FY18, not directly comparable), and the 2017 gap in the chart is a known duplicate value in CAIC's own report rather than missing data. FY21-22's fatality count is backfilled rather than report-stated, and 10 seasons is enough to see a direction, not enough to prove one. A peer-reviewed 2022 study using CAIC's own fatality data tried to track avalanche-education trends over a similar window and had to drop the analysis entirely — 78% of the underlying reports didn't record it.”</w:t>
-      </w:r>
-    </w:p>
-    <w:p>
-      <w:pPr>
-        <w:spacing w:after="160"/>
-      </w:pPr>
-      <w:r>
-        <w:rPr>
-          <w:rFonts w:ascii="Calibri" w:cs="Calibri" w:eastAsia="Calibri" w:hAnsi="Calibri"/>
-          <w:b/>
-          <w:bCs/>
-        </w:rPr>
-        <w:t xml:space="preserve">Naming note: </w:t>
-      </w:r>
-      <w:r>
-        <w:rPr>
-          <w:rFonts w:ascii="Calibri" w:cs="Calibri" w:eastAsia="Calibri" w:hAnsi="Calibri"/>
-        </w:rPr>
-        <w:t xml:space="preserve">this page is labeled </w:t>
-      </w:r>
-      <w:r>
-        <w:rPr>
-          <w:rFonts w:ascii="Consolas" w:cs="Consolas" w:eastAsia="Consolas" w:hAnsi="Consolas"/>
-          <w:sz w:val="20"/>
-          <w:szCs w:val="20"/>
-          <w:shd w:fill="F0F0F0"/>
+        <w:t xml:space="preserve">Caveats, as written on the page:</w:t>
+      </w:r>
+      <w:r>
+        <w:rPr>
+          <w:rFonts w:ascii="Calibri" w:cs="Calibri" w:eastAsia="Calibri" w:hAnsi="Calibri"/>
+        </w:rPr>
+        <w:t xml:space="preserve"> "This measures engagement with CAIC's safety information, not a participant headcount — it can't tell one person checking daily from many checking once, and some traffic is storm- or news-driven rather than trip-planning. Ten seasons is enough to see a direction, not enough to prove one. 2017 excluded as suspected duplicate data entry (see Data Quality and Methodology)." The metric definition-change and FY21-22 backfill caveats moved to the Data Quality and Methodology appendix rather than repeating on this page; see the appendix below for the current wording. A peer-reviewed 2022 study using CAIC's own fatality data tried to track avalanche-education trends over a similar window and had to drop the analysis entirely — 78% of the underlying reports didn't record it (background context, not on the page itself).</w:t>
+      </w:r>
+    </w:p>
+    <w:p>
+      <w:pPr>
+        <w:spacing w:after="160"/>
+      </w:pPr>
+      <w:r>
+        <w:rPr>
+          <w:rFonts w:ascii="Calibri" w:cs="Calibri" w:eastAsia="Calibri" w:hAnsi="Calibri"/>
+          <w:b/>
+          <w:bCs/>
+        </w:rPr>
+        <w:t xml:space="preserve">Naming note:</w:t>
+      </w:r>
+      <w:r>
+        <w:rPr>
+          <w:rFonts w:ascii="Calibri" w:cs="Calibri" w:eastAsia="Calibri" w:hAnsi="Calibri"/>
+        </w:rPr>
+        <w:t xml:space="preserve"> this page is labeled </w:t>
+      </w:r>
+      <w:r>
+        <w:rPr>
+          <w:rFonts w:ascii="Consolas" w:cs="Consolas" w:eastAsia="Consolas" w:hAnsi="Consolas"/>
+          <w:sz w:val="20"/>
+          <w:szCs w:val="20"/>
+          <w:shd w:fill="F0F0F0" w:val="clear"/>
         </w:rPr>
         <w:t xml:space="preserve">Q5</w:t>
       </w:r>
@@ -2041,7 +2218,7 @@
           <w:rFonts w:ascii="Consolas" w:cs="Consolas" w:eastAsia="Consolas" w:hAnsi="Consolas"/>
           <w:sz w:val="20"/>
           <w:szCs w:val="20"/>
-          <w:shd w:fill="F0F0F0"/>
+          <w:shd w:fill="F0F0F0" w:val="clear"/>
         </w:rPr>
         <w:t xml:space="preserve">Data Quality and Methodology</w:t>
       </w:r>
@@ -2051,14 +2228,6 @@
         </w:rPr>
         <w:t xml:space="preserve">) has moved to an appendix at the end of this document — it was never actually a findings-bearing research question, it's a page that qualifies all of them, so it doesn't need a Q-number of its own.</w:t>
       </w:r>
-    </w:p>
-    <w:p>
-      <w:pPr>
-        <w:pBdr>
-          <w:bottom w:val="single" w:color="AAAAAA" w:sz="6" w:space="1"/>
-        </w:pBdr>
-        <w:spacing w:after="240" w:before="120"/>
-      </w:pPr>
     </w:p>
     <w:p>
       <w:pPr>
@@ -2082,14 +2251,6 @@
     </w:p>
     <w:p>
       <w:pPr>
-        <w:pBdr>
-          <w:bottom w:val="single" w:color="AAAAAA" w:sz="6" w:space="1"/>
-        </w:pBdr>
-        <w:spacing w:after="240" w:before="120"/>
-      </w:pPr>
-    </w:p>
-    <w:p>
-      <w:pPr>
         <w:pStyle w:val="Heading2"/>
         <w:spacing w:after="160" w:before="240"/>
       </w:pPr>
@@ -2118,52 +2279,58 @@
           <w:b/>
           <w:bCs/>
         </w:rPr>
-        <w:t xml:space="preserve">Question: </w:t>
-      </w:r>
-      <w:r>
-        <w:rPr>
-          <w:rFonts w:ascii="Calibri" w:cs="Calibri" w:eastAsia="Calibri" w:hAnsi="Calibri"/>
-        </w:rPr>
-        <w:t xml:space="preserve">How has the record-keeping itself changed over 75 years, and what does that mean for how much weight any of the above findings can actually bear?</w:t>
-      </w:r>
-    </w:p>
-    <w:p>
-      <w:pPr>
-        <w:spacing w:after="160"/>
-      </w:pPr>
-      <w:r>
-        <w:rPr>
-          <w:rFonts w:ascii="Calibri" w:cs="Calibri" w:eastAsia="Calibri" w:hAnsi="Calibri"/>
-          <w:b/>
-          <w:bCs/>
-        </w:rPr>
-        <w:t xml:space="preserve">Why it matters: </w:t>
-      </w:r>
-      <w:r>
-        <w:rPr>
-          <w:rFonts w:ascii="Calibri" w:cs="Calibri" w:eastAsia="Calibri" w:hAnsi="Calibri"/>
-        </w:rPr>
-        <w:t xml:space="preserve">Every numbered question on this dashboard is gated by this one. A viewer who only sees the pretty trend lines and never sees this page could walk away trusting comparisons the data can't actually support.</w:t>
-      </w:r>
-    </w:p>
-    <w:p>
-      <w:pPr>
-        <w:spacing w:after="160"/>
-      </w:pPr>
-      <w:r>
-        <w:rPr>
-          <w:rFonts w:ascii="Calibri" w:cs="Calibri" w:eastAsia="Calibri" w:hAnsi="Calibri"/>
-          <w:b/>
-          <w:bCs/>
-        </w:rPr>
-        <w:t xml:space="preserve">Supports it: </w:t>
-      </w:r>
-      <w:r>
-        <w:rPr>
-          <w:rFonts w:ascii="Consolas" w:cs="Consolas" w:eastAsia="Consolas" w:hAnsi="Consolas"/>
-          <w:sz w:val="20"/>
-          <w:szCs w:val="20"/>
-          <w:shd w:fill="F0F0F0"/>
+        <w:t xml:space="preserve">Question:</w:t>
+      </w:r>
+      <w:r>
+        <w:rPr>
+          <w:rFonts w:ascii="Calibri" w:cs="Calibri" w:eastAsia="Calibri" w:hAnsi="Calibri"/>
+        </w:rPr>
+        <w:t xml:space="preserve"> How has the record-keeping itself changed over 75 years, and what does that mean for how much weight any of the above findings can actually bear?</w:t>
+      </w:r>
+    </w:p>
+    <w:p>
+      <w:pPr>
+        <w:spacing w:after="160"/>
+      </w:pPr>
+      <w:r>
+        <w:rPr>
+          <w:rFonts w:ascii="Calibri" w:cs="Calibri" w:eastAsia="Calibri" w:hAnsi="Calibri"/>
+          <w:b/>
+          <w:bCs/>
+        </w:rPr>
+        <w:t xml:space="preserve">Why it matters:</w:t>
+      </w:r>
+      <w:r>
+        <w:rPr>
+          <w:rFonts w:ascii="Calibri" w:cs="Calibri" w:eastAsia="Calibri" w:hAnsi="Calibri"/>
+        </w:rPr>
+        <w:t xml:space="preserve"> Every numbered question on this dashboard is gated by this one. A viewer who only sees the pretty trend lines and never sees this page could walk away trusting comparisons the data can't actually support.</w:t>
+      </w:r>
+    </w:p>
+    <w:p>
+      <w:pPr>
+        <w:spacing w:after="160"/>
+      </w:pPr>
+      <w:r>
+        <w:rPr>
+          <w:rFonts w:ascii="Calibri" w:cs="Calibri" w:eastAsia="Calibri" w:hAnsi="Calibri"/>
+          <w:b/>
+          <w:bCs/>
+        </w:rPr>
+        <w:t xml:space="preserve">Supports it:</w:t>
+      </w:r>
+      <w:r>
+        <w:rPr>
+          <w:rFonts w:ascii="Calibri" w:cs="Calibri" w:eastAsia="Calibri" w:hAnsi="Calibri"/>
+        </w:rPr>
+        <w:t xml:space="preserve"> </w:t>
+      </w:r>
+      <w:r>
+        <w:rPr>
+          <w:rFonts w:ascii="Consolas" w:cs="Consolas" w:eastAsia="Consolas" w:hAnsi="Consolas"/>
+          <w:sz w:val="20"/>
+          <w:szCs w:val="20"/>
+          <w:shd w:fill="F0F0F0" w:val="clear"/>
         </w:rPr>
         <w:t xml:space="preserve">HasLocation</w:t>
       </w:r>
@@ -2178,7 +2345,7 @@
           <w:rFonts w:ascii="Consolas" w:cs="Consolas" w:eastAsia="Consolas" w:hAnsi="Consolas"/>
           <w:sz w:val="20"/>
           <w:szCs w:val="20"/>
-          <w:shd w:fill="F0F0F0"/>
+          <w:shd w:fill="F0F0F0" w:val="clear"/>
         </w:rPr>
         <w:t xml:space="preserve">HasDescription</w:t>
       </w:r>
@@ -2193,7 +2360,7 @@
           <w:rFonts w:ascii="Consolas" w:cs="Consolas" w:eastAsia="Consolas" w:hAnsi="Consolas"/>
           <w:sz w:val="20"/>
           <w:szCs w:val="20"/>
-          <w:shd w:fill="F0F0F0"/>
+          <w:shd w:fill="F0F0F0" w:val="clear"/>
         </w:rPr>
         <w:t xml:space="preserve">fact_table_data_dictionary.md</w:t>
       </w:r>
@@ -2208,7 +2375,7 @@
           <w:rFonts w:ascii="Consolas" w:cs="Consolas" w:eastAsia="Consolas" w:hAnsi="Consolas"/>
           <w:sz w:val="20"/>
           <w:szCs w:val="20"/>
-          <w:shd w:fill="F0F0F0"/>
+          <w:shd w:fill="F0F0F0" w:val="clear"/>
         </w:rPr>
         <w:t xml:space="preserve">caic_engagement_data_dictionary.md</w:t>
       </w:r>
@@ -2229,20 +2396,20 @@
           <w:b/>
           <w:bCs/>
         </w:rPr>
-        <w:t xml:space="preserve">Status: Done. </w:t>
-      </w:r>
-      <w:r>
-        <w:rPr>
-          <w:rFonts w:ascii="Calibri" w:cs="Calibri" w:eastAsia="Calibri" w:hAnsi="Calibri"/>
-        </w:rPr>
-        <w:t xml:space="preserve">Built as a page (</w:t>
-      </w:r>
-      <w:r>
-        <w:rPr>
-          <w:rFonts w:ascii="Consolas" w:cs="Consolas" w:eastAsia="Consolas" w:hAnsi="Consolas"/>
-          <w:sz w:val="20"/>
-          <w:szCs w:val="20"/>
-          <w:shd w:fill="F0F0F0"/>
+        <w:t xml:space="preserve">Status: Done.</w:t>
+      </w:r>
+      <w:r>
+        <w:rPr>
+          <w:rFonts w:ascii="Calibri" w:cs="Calibri" w:eastAsia="Calibri" w:hAnsi="Calibri"/>
+        </w:rPr>
+        <w:t xml:space="preserve"> Built as a page (</w:t>
+      </w:r>
+      <w:r>
+        <w:rPr>
+          <w:rFonts w:ascii="Consolas" w:cs="Consolas" w:eastAsia="Consolas" w:hAnsi="Consolas"/>
+          <w:sz w:val="20"/>
+          <w:szCs w:val="20"/>
+          <w:shd w:fill="F0F0F0" w:val="clear"/>
         </w:rPr>
         <w:t xml:space="preserve">Data Quality and Methodology</w:t>
       </w:r>
@@ -2257,7 +2424,7 @@
           <w:rFonts w:ascii="Consolas" w:cs="Consolas" w:eastAsia="Consolas" w:hAnsi="Consolas"/>
           <w:sz w:val="20"/>
           <w:szCs w:val="20"/>
-          <w:shd w:fill="F0F0F0"/>
+          <w:shd w:fill="F0F0F0" w:val="clear"/>
         </w:rPr>
         <w:t xml:space="preserve">% HasLocation</w:t>
       </w:r>
@@ -2272,7 +2439,7 @@
           <w:rFonts w:ascii="Consolas" w:cs="Consolas" w:eastAsia="Consolas" w:hAnsi="Consolas"/>
           <w:sz w:val="20"/>
           <w:szCs w:val="20"/>
-          <w:shd w:fill="F0F0F0"/>
+          <w:shd w:fill="F0F0F0" w:val="clear"/>
         </w:rPr>
         <w:t xml:space="preserve">% HasDescription</w:t>
       </w:r>
@@ -2287,7 +2454,7 @@
           <w:rFonts w:ascii="Consolas" w:cs="Consolas" w:eastAsia="Consolas" w:hAnsi="Consolas"/>
           <w:sz w:val="20"/>
           <w:szCs w:val="20"/>
-          <w:shd w:fill="F0F0F0"/>
+          <w:shd w:fill="F0F0F0" w:val="clear"/>
         </w:rPr>
         <w:t xml:space="preserve">Decade</w:t>
       </w:r>
@@ -2295,14 +2462,14 @@
         <w:rPr>
           <w:rFonts w:ascii="Calibri" w:cs="Calibri" w:eastAsia="Calibri" w:hAnsi="Calibri"/>
         </w:rPr>
-        <w:t xml:space="preserve">) and four caveat text boxes. The chart tells the “record-keeping changed over 75 years” story on its own: both fields sit at 0% through the 1950s-1990s, </w:t>
-      </w:r>
-      <w:r>
-        <w:rPr>
-          <w:rFonts w:ascii="Consolas" w:cs="Consolas" w:eastAsia="Consolas" w:hAnsi="Consolas"/>
-          <w:sz w:val="20"/>
-          <w:szCs w:val="20"/>
-          <w:shd w:fill="F0F0F0"/>
+        <w:t xml:space="preserve">) and four caveat text boxes. The chart tells the "record-keeping changed over 75 years" story on its own: both fields sit at 0% through the 1950s-1990s, </w:t>
+      </w:r>
+      <w:r>
+        <w:rPr>
+          <w:rFonts w:ascii="Consolas" w:cs="Consolas" w:eastAsia="Consolas" w:hAnsi="Consolas"/>
+          <w:sz w:val="20"/>
+          <w:szCs w:val="20"/>
+          <w:shd w:fill="F0F0F0" w:val="clear"/>
         </w:rPr>
         <w:t xml:space="preserve">% HasLocation</w:t>
       </w:r>
@@ -2317,7 +2484,7 @@
           <w:rFonts w:ascii="Consolas" w:cs="Consolas" w:eastAsia="Consolas" w:hAnsi="Consolas"/>
           <w:sz w:val="20"/>
           <w:szCs w:val="20"/>
-          <w:shd w:fill="F0F0F0"/>
+          <w:shd w:fill="F0F0F0" w:val="clear"/>
         </w:rPr>
         <w:t xml:space="preserve">% HasDescription</w:t>
       </w:r>
@@ -2325,44 +2492,142 @@
         <w:rPr>
           <w:rFonts w:ascii="Calibri" w:cs="Calibri" w:eastAsia="Calibri" w:hAnsi="Calibri"/>
         </w:rPr>
-        <w:t xml:space="preserve"> only starts climbing a decade later (63.8% in the 2010s), and both reach 100% by the 2020s. The four caveats carried onto the page: (1) investigator judgment — </w:t>
-      </w:r>
-      <w:r>
-        <w:rPr>
-          <w:rFonts w:ascii="Consolas" w:cs="Consolas" w:eastAsia="Consolas" w:hAnsi="Consolas"/>
-          <w:sz w:val="20"/>
-          <w:szCs w:val="20"/>
-          <w:shd w:fill="F0F0F0"/>
-        </w:rPr>
-        <w:t xml:space="preserve">Setting</w:t>
-      </w:r>
-      <w:r>
-        <w:rPr>
-          <w:rFonts w:ascii="Calibri" w:cs="Calibri" w:eastAsia="Calibri" w:hAnsi="Calibri"/>
-        </w:rPr>
-        <w:t xml:space="preserve">, </w:t>
-      </w:r>
-      <w:r>
-        <w:rPr>
-          <w:rFonts w:ascii="Consolas" w:cs="Consolas" w:eastAsia="Consolas" w:hAnsi="Consolas"/>
-          <w:sz w:val="20"/>
-          <w:szCs w:val="20"/>
-          <w:shd w:fill="F0F0F0"/>
-        </w:rPr>
-        <w:t xml:space="preserve">PrimaryActivity</w:t>
-      </w:r>
-      <w:r>
-        <w:rPr>
-          <w:rFonts w:ascii="Calibri" w:cs="Calibri" w:eastAsia="Calibri" w:hAnsi="Calibri"/>
-        </w:rPr>
-        <w:t xml:space="preserve">, and other categorical fields reflect individual investigators' judgment, not a standardized taxonomy (Spencer Logan, CAIC); (2) Colorado vs. rest of nation — Colorado's rows were investigated directly by CAIC staff, other states' only compiled from other sources, making Colorado the most internally consistent subset (ties directly to Q3's framing); (3) the CAIC engagement metric used on Q5 changes its own definition mid-series and carries a suspected duplicate (FY16-17) and a backfilled value (FY21-22); (4) </w:t>
-      </w:r>
-      <w:r>
-        <w:rPr>
-          <w:rFonts w:ascii="Consolas" w:cs="Consolas" w:eastAsia="Consolas" w:hAnsi="Consolas"/>
-          <w:sz w:val="20"/>
-          <w:szCs w:val="20"/>
-          <w:shd w:fill="F0F0F0"/>
+        <w:t xml:space="preserve"> only starts climbing a decade later (63.8% in the 2010s), and both reach 100% by the 2020s.</w:t>
+      </w:r>
+    </w:p>
+    <w:p>
+      <w:pPr>
+        <w:spacing w:after="160"/>
+      </w:pPr>
+      <w:r>
+        <w:rPr>
+          <w:rFonts w:ascii="Calibri" w:cs="Calibri" w:eastAsia="Calibri" w:hAnsi="Calibri"/>
+          <w:b/>
+          <w:bCs/>
+        </w:rPr>
+        <w:t xml:space="preserve">The four caveats, as written on the page:</w:t>
+      </w:r>
+    </w:p>
+    <w:p>
+      <w:pPr>
+        <w:pStyle w:val="ListParagraph"/>
+        <w:numPr>
+          <w:ilvl w:val="0"/>
+          <w:numId w:val="3"/>
+        </w:numPr>
+        <w:spacing w:after="160"/>
+      </w:pPr>
+      <w:r>
+        <w:rPr>
+          <w:rFonts w:ascii="Calibri" w:cs="Calibri" w:eastAsia="Calibri" w:hAnsi="Calibri"/>
+          <w:b/>
+          <w:bCs/>
+        </w:rPr>
+        <w:t xml:space="preserve">Investigator judgment:</w:t>
+      </w:r>
+      <w:r>
+        <w:rPr>
+          <w:rFonts w:ascii="Calibri" w:cs="Calibri" w:eastAsia="Calibri" w:hAnsi="Calibri"/>
+        </w:rPr>
+        <w:t xml:space="preserve"> "Setting, PrimaryActivity, and other categorical fields reflect individual investigators' judgment at the time, not a standardized taxonomy applied consistently across 75 years (confirmed by CAIC's Spencer Logan). An apparent shift in the data may partly reflect changing investigator conventions, not just changing conditions on the mountain."</w:t>
+      </w:r>
+    </w:p>
+    <w:p>
+      <w:pPr>
+        <w:pStyle w:val="ListParagraph"/>
+        <w:numPr>
+          <w:ilvl w:val="0"/>
+          <w:numId w:val="3"/>
+        </w:numPr>
+        <w:spacing w:after="160"/>
+      </w:pPr>
+      <w:r>
+        <w:rPr>
+          <w:rFonts w:ascii="Calibri" w:cs="Calibri" w:eastAsia="Calibri" w:hAnsi="Calibri"/>
+          <w:b/>
+          <w:bCs/>
+        </w:rPr>
+        <w:t xml:space="preserve">Colorado vs. rest of nation:</w:t>
+      </w:r>
+      <w:r>
+        <w:rPr>
+          <w:rFonts w:ascii="Calibri" w:cs="Calibri" w:eastAsia="Calibri" w:hAnsi="Calibri"/>
+        </w:rPr>
+        <w:t xml:space="preserve"> "Colorado's own rows were investigated directly by CAIC staff; incidents in other states were only compiled from other sources. Colorado's data is the most internally consistent subset in this dataset, a reason to trust Colorado-specific comparisons (like Q3) more than nationwide ones."</w:t>
+      </w:r>
+    </w:p>
+    <w:p>
+      <w:pPr>
+        <w:pStyle w:val="ListParagraph"/>
+        <w:numPr>
+          <w:ilvl w:val="0"/>
+          <w:numId w:val="3"/>
+        </w:numPr>
+        <w:spacing w:after="160"/>
+      </w:pPr>
+      <w:r>
+        <w:rPr>
+          <w:rFonts w:ascii="Calibri" w:cs="Calibri" w:eastAsia="Calibri" w:hAnsi="Calibri"/>
+          <w:b/>
+          <w:bCs/>
+        </w:rPr>
+        <w:t xml:space="preserve">Engagement metric changes:</w:t>
+      </w:r>
+      <w:r>
+        <w:rPr>
+          <w:rFonts w:ascii="Calibri" w:cs="Calibri" w:eastAsia="Calibri" w:hAnsi="Calibri"/>
+        </w:rPr>
+        <w:t xml:space="preserve"> "The CAIC engagement proxy used on Q5 switches definitions mid-series: visits through FY17, then pageviews from FY18 on. A separate 'users' figure was added alongside pageviews starting FY21, not as a third replacement stage. Has one suspected duplicate data point (FY16-17) and one backfilled fatality count (FY21-22) rather than report-stated. It's directionally useful, not a single clean line."</w:t>
+      </w:r>
+    </w:p>
+    <w:p>
+      <w:pPr>
+        <w:pStyle w:val="ListParagraph"/>
+        <w:numPr>
+          <w:ilvl w:val="0"/>
+          <w:numId w:val="3"/>
+        </w:numPr>
+        <w:spacing w:after="160"/>
+      </w:pPr>
+      <w:r>
+        <w:rPr>
+          <w:rFonts w:ascii="Calibri" w:cs="Calibri" w:eastAsia="Calibri" w:hAnsi="Calibri"/>
+          <w:b/>
+          <w:bCs/>
+        </w:rPr>
+        <w:t xml:space="preserve">2025 is provisional:</w:t>
+      </w:r>
+      <w:r>
+        <w:rPr>
+          <w:rFonts w:ascii="Calibri" w:cs="Calibri" w:eastAsia="Calibri" w:hAnsi="Calibri"/>
+        </w:rPr>
+        <w:t xml:space="preserve"> "CAIC's own raw data flags 2024-25 as still 'Current Year' as of this export, not a closed, finalized season. Any total or chart including AvyYear 2025 should be read as provisional, not final."</w:t>
+      </w:r>
+    </w:p>
+    <w:p>
+      <w:pPr>
+        <w:spacing w:after="160"/>
+      </w:pPr>
+      <w:r>
+        <w:rPr>
+          <w:rFonts w:ascii="Calibri" w:cs="Calibri" w:eastAsia="Calibri" w:hAnsi="Calibri"/>
+          <w:b/>
+          <w:bCs/>
+        </w:rPr>
+        <w:t xml:space="preserve">Build note:</w:t>
+      </w:r>
+      <w:r>
+        <w:rPr>
+          <w:rFonts w:ascii="Calibri" w:cs="Calibri" w:eastAsia="Calibri" w:hAnsi="Calibri"/>
+        </w:rPr>
+        <w:t xml:space="preserve"> building the coverage chart surfaced a second real DAX lesson (the first being the </w:t>
+      </w:r>
+      <w:r>
+        <w:rPr>
+          <w:rFonts w:ascii="Consolas" w:cs="Consolas" w:eastAsia="Consolas" w:hAnsi="Consolas"/>
+          <w:sz w:val="20"/>
+          <w:szCs w:val="20"/>
+          <w:shd w:fill="F0F0F0" w:val="clear"/>
         </w:rPr>
         <w:t xml:space="preserve">AvyYear</w:t>
       </w:r>
@@ -2370,33 +2635,193 @@
         <w:rPr>
           <w:rFonts w:ascii="Calibri" w:cs="Calibri" w:eastAsia="Calibri" w:hAnsi="Calibri"/>
         </w:rPr>
-        <w:t xml:space="preserve"> 2025 is CAIC's own flagged “Current Year” as of this export and should be read as provisional, not a finalized season.</w:t>
-      </w:r>
-    </w:p>
-    <w:p>
-      <w:pPr>
-        <w:spacing w:after="160"/>
-      </w:pPr>
-      <w:r>
-        <w:rPr>
-          <w:rFonts w:ascii="Calibri" w:cs="Calibri" w:eastAsia="Calibri" w:hAnsi="Calibri"/>
-          <w:b/>
-          <w:bCs/>
-        </w:rPr>
-        <w:t xml:space="preserve">Build note: </w:t>
-      </w:r>
-      <w:r>
-        <w:rPr>
-          <w:rFonts w:ascii="Calibri" w:cs="Calibri" w:eastAsia="Calibri" w:hAnsi="Calibri"/>
-        </w:rPr>
-        <w:t xml:space="preserve">building the coverage chart surfaced a second real DAX lesson (the first being the </w:t>
-      </w:r>
-      <w:r>
-        <w:rPr>
-          <w:rFonts w:ascii="Consolas" w:cs="Consolas" w:eastAsia="Consolas" w:hAnsi="Consolas"/>
-          <w:sz w:val="20"/>
-          <w:szCs w:val="20"/>
-          <w:shd w:fill="F0F0F0"/>
+        <w:t xml:space="preserve"> Text-import bug from Q4). A </w:t>
+      </w:r>
+      <w:r>
+        <w:rPr>
+          <w:rFonts w:ascii="Consolas" w:cs="Consolas" w:eastAsia="Consolas" w:hAnsi="Consolas"/>
+          <w:sz w:val="20"/>
+          <w:szCs w:val="20"/>
+          <w:shd w:fill="F0F0F0" w:val="clear"/>
+        </w:rPr>
+        <w:t xml:space="preserve">DIVIDE</w:t>
+      </w:r>
+      <w:r>
+        <w:rPr>
+          <w:rFonts w:ascii="Calibri" w:cs="Calibri" w:eastAsia="Calibri" w:hAnsi="Calibri"/>
+        </w:rPr>
+        <w:t xml:space="preserve"> measure that should mathematically evaluate to </w:t>
+      </w:r>
+      <w:r>
+        <w:rPr>
+          <w:rFonts w:ascii="Consolas" w:cs="Consolas" w:eastAsia="Consolas" w:hAnsi="Consolas"/>
+          <w:sz w:val="20"/>
+          <w:szCs w:val="20"/>
+          <w:shd w:fill="F0F0F0" w:val="clear"/>
+        </w:rPr>
+        <w:t xml:space="preserve">0</w:t>
+      </w:r>
+      <w:r>
+        <w:rPr>
+          <w:rFonts w:ascii="Calibri" w:cs="Calibri" w:eastAsia="Calibri" w:hAnsi="Calibri"/>
+        </w:rPr>
+        <w:t xml:space="preserve"> for a decade with zero matching rows (e.g. </w:t>
+      </w:r>
+      <w:r>
+        <w:rPr>
+          <w:rFonts w:ascii="Consolas" w:cs="Consolas" w:eastAsia="Consolas" w:hAnsi="Consolas"/>
+          <w:sz w:val="20"/>
+          <w:szCs w:val="20"/>
+          <w:shd w:fill="F0F0F0" w:val="clear"/>
+        </w:rPr>
+        <w:t xml:space="preserve">% HasLocation</w:t>
+      </w:r>
+      <w:r>
+        <w:rPr>
+          <w:rFonts w:ascii="Calibri" w:cs="Calibri" w:eastAsia="Calibri" w:hAnsi="Calibri"/>
+        </w:rPr>
+        <w:t xml:space="preserve"> in the 1950s) instead evaluated to </w:t>
+      </w:r>
+      <w:r>
+        <w:rPr>
+          <w:rFonts w:ascii="Calibri" w:cs="Calibri" w:eastAsia="Calibri" w:hAnsi="Calibri"/>
+          <w:b/>
+          <w:bCs/>
+        </w:rPr>
+        <w:t xml:space="preserve">blank</w:t>
+      </w:r>
+      <w:r>
+        <w:rPr>
+          <w:rFonts w:ascii="Calibri" w:cs="Calibri" w:eastAsia="Calibri" w:hAnsi="Calibri"/>
+        </w:rPr>
+        <w:t xml:space="preserve">, which caused Power BI's table/line-chart visuals to silently drop that decade's entire row/category — five of eight decades vanished from the chart until this was caught. Root cause: Power BI's table query engine (</w:t>
+      </w:r>
+      <w:r>
+        <w:rPr>
+          <w:rFonts w:ascii="Consolas" w:cs="Consolas" w:eastAsia="Consolas" w:hAnsi="Consolas"/>
+          <w:sz w:val="20"/>
+          <w:szCs w:val="20"/>
+          <w:shd w:fill="F0F0F0" w:val="clear"/>
+        </w:rPr>
+        <w:t xml:space="preserve">SUMMARIZECOLUMNS</w:t>
+      </w:r>
+      <w:r>
+        <w:rPr>
+          <w:rFonts w:ascii="Calibri" w:cs="Calibri" w:eastAsia="Calibri" w:hAnsi="Calibri"/>
+        </w:rPr>
+        <w:t xml:space="preserve">) can collapse a same-table </w:t>
+      </w:r>
+      <w:r>
+        <w:rPr>
+          <w:rFonts w:ascii="Consolas" w:cs="Consolas" w:eastAsia="Consolas" w:hAnsi="Consolas"/>
+          <w:sz w:val="20"/>
+          <w:szCs w:val="20"/>
+          <w:shd w:fill="F0F0F0" w:val="clear"/>
+        </w:rPr>
+        <w:t xml:space="preserve">CALCULATE</w:t>
+      </w:r>
+      <w:r>
+        <w:rPr>
+          <w:rFonts w:ascii="Calibri" w:cs="Calibri" w:eastAsia="Calibri" w:hAnsi="Calibri"/>
+        </w:rPr>
+        <w:t xml:space="preserve"> filter that matches zero rows into </w:t>
+      </w:r>
+      <w:r>
+        <w:rPr>
+          <w:rFonts w:ascii="Consolas" w:cs="Consolas" w:eastAsia="Consolas" w:hAnsi="Consolas"/>
+          <w:sz w:val="20"/>
+          <w:szCs w:val="20"/>
+          <w:shd w:fill="F0F0F0" w:val="clear"/>
+        </w:rPr>
+        <w:t xml:space="preserve">BLANK()</w:t>
+      </w:r>
+      <w:r>
+        <w:rPr>
+          <w:rFonts w:ascii="Calibri" w:cs="Calibri" w:eastAsia="Calibri" w:hAnsi="Calibri"/>
+        </w:rPr>
+        <w:t xml:space="preserve"> rather than a literal </w:t>
+      </w:r>
+      <w:r>
+        <w:rPr>
+          <w:rFonts w:ascii="Consolas" w:cs="Consolas" w:eastAsia="Consolas" w:hAnsi="Consolas"/>
+          <w:sz w:val="20"/>
+          <w:szCs w:val="20"/>
+          <w:shd w:fill="F0F0F0" w:val="clear"/>
+        </w:rPr>
+        <w:t xml:space="preserve">0</w:t>
+      </w:r>
+      <w:r>
+        <w:rPr>
+          <w:rFonts w:ascii="Calibri" w:cs="Calibri" w:eastAsia="Calibri" w:hAnsi="Calibri"/>
+        </w:rPr>
+        <w:t xml:space="preserve">, even though </w:t>
+      </w:r>
+      <w:r>
+        <w:rPr>
+          <w:rFonts w:ascii="Consolas" w:cs="Consolas" w:eastAsia="Consolas" w:hAnsi="Consolas"/>
+          <w:sz w:val="20"/>
+          <w:szCs w:val="20"/>
+          <w:shd w:fill="F0F0F0" w:val="clear"/>
+        </w:rPr>
+        <w:t xml:space="preserve">DIVIDE</w:t>
+      </w:r>
+      <w:r>
+        <w:rPr>
+          <w:rFonts w:ascii="Calibri" w:cs="Calibri" w:eastAsia="Calibri" w:hAnsi="Calibri"/>
+        </w:rPr>
+        <w:t xml:space="preserve">'s own documented behavior only substitutes blank when the *denominator* is zero. Fix: append </w:t>
+      </w:r>
+      <w:r>
+        <w:rPr>
+          <w:rFonts w:ascii="Consolas" w:cs="Consolas" w:eastAsia="Consolas" w:hAnsi="Consolas"/>
+          <w:sz w:val="20"/>
+          <w:szCs w:val="20"/>
+          <w:shd w:fill="F0F0F0" w:val="clear"/>
+        </w:rPr>
+        <w:t xml:space="preserve">+ 0</w:t>
+      </w:r>
+      <w:r>
+        <w:rPr>
+          <w:rFonts w:ascii="Calibri" w:cs="Calibri" w:eastAsia="Calibri" w:hAnsi="Calibri"/>
+        </w:rPr>
+        <w:t xml:space="preserve"> to the end of the measure, which coerces any blank result back to a real zero (</w:t>
+      </w:r>
+      <w:r>
+        <w:rPr>
+          <w:rFonts w:ascii="Consolas" w:cs="Consolas" w:eastAsia="Consolas" w:hAnsi="Consolas"/>
+          <w:sz w:val="20"/>
+          <w:szCs w:val="20"/>
+          <w:shd w:fill="F0F0F0" w:val="clear"/>
+        </w:rPr>
+        <w:t xml:space="preserve">BLANK() + 0 = 0</w:t>
+      </w:r>
+      <w:r>
+        <w:rPr>
+          <w:rFonts w:ascii="Calibri" w:cs="Calibri" w:eastAsia="Calibri" w:hAnsi="Calibri"/>
+        </w:rPr>
+        <w:t xml:space="preserve"> in DAX) — a small, well-known workaround for this exact class of bug. Caught the same way as the </w:t>
+      </w:r>
+      <w:r>
+        <w:rPr>
+          <w:rFonts w:ascii="Consolas" w:cs="Consolas" w:eastAsia="Consolas" w:hAnsi="Consolas"/>
+          <w:sz w:val="20"/>
+          <w:szCs w:val="20"/>
+          <w:shd w:fill="F0F0F0" w:val="clear"/>
+        </w:rPr>
+        <w:t xml:space="preserve">PeopleCaughtParsed</w:t>
+      </w:r>
+      <w:r>
+        <w:rPr>
+          <w:rFonts w:ascii="Calibri" w:cs="Calibri" w:eastAsia="Calibri" w:hAnsi="Calibri"/>
+        </w:rPr>
+        <w:t xml:space="preserve"> and </w:t>
+      </w:r>
+      <w:r>
+        <w:rPr>
+          <w:rFonts w:ascii="Consolas" w:cs="Consolas" w:eastAsia="Consolas" w:hAnsi="Consolas"/>
+          <w:sz w:val="20"/>
+          <w:szCs w:val="20"/>
+          <w:shd w:fill="F0F0F0" w:val="clear"/>
         </w:rPr>
         <w:t xml:space="preserve">AvyYear</w:t>
       </w:r>
@@ -2404,134 +2829,14 @@
         <w:rPr>
           <w:rFonts w:ascii="Calibri" w:cs="Calibri" w:eastAsia="Calibri" w:hAnsi="Calibri"/>
         </w:rPr>
-        <w:t xml:space="preserve"> Text-import bug from Q4). A </w:t>
-      </w:r>
-      <w:r>
-        <w:rPr>
-          <w:rFonts w:ascii="Consolas" w:cs="Consolas" w:eastAsia="Consolas" w:hAnsi="Consolas"/>
-          <w:sz w:val="20"/>
-          <w:szCs w:val="20"/>
-          <w:shd w:fill="F0F0F0"/>
-        </w:rPr>
-        <w:t xml:space="preserve">DIVIDE</w:t>
-      </w:r>
-      <w:r>
-        <w:rPr>
-          <w:rFonts w:ascii="Calibri" w:cs="Calibri" w:eastAsia="Calibri" w:hAnsi="Calibri"/>
-        </w:rPr>
-        <w:t xml:space="preserve"> measure that should mathematically evaluate to </w:t>
-      </w:r>
-      <w:r>
-        <w:rPr>
-          <w:rFonts w:ascii="Consolas" w:cs="Consolas" w:eastAsia="Consolas" w:hAnsi="Consolas"/>
-          <w:sz w:val="20"/>
-          <w:szCs w:val="20"/>
-          <w:shd w:fill="F0F0F0"/>
-        </w:rPr>
-        <w:t xml:space="preserve">0</w:t>
-      </w:r>
-      <w:r>
-        <w:rPr>
-          <w:rFonts w:ascii="Calibri" w:cs="Calibri" w:eastAsia="Calibri" w:hAnsi="Calibri"/>
-        </w:rPr>
-        <w:t xml:space="preserve"> for a decade with zero matching rows instead evaluated to blank, which caused Power BI's table/line-chart visuals to silently drop that decade's entire row/category — five of eight decades vanished from the chart until this was caught. Root cause: Power BI's visual query engine (</w:t>
-      </w:r>
-      <w:r>
-        <w:rPr>
-          <w:rFonts w:ascii="Consolas" w:cs="Consolas" w:eastAsia="Consolas" w:hAnsi="Consolas"/>
-          <w:sz w:val="20"/>
-          <w:szCs w:val="20"/>
-          <w:shd w:fill="F0F0F0"/>
-        </w:rPr>
-        <w:t xml:space="preserve">SUMMARIZECOLUMNS</w:t>
-      </w:r>
-      <w:r>
-        <w:rPr>
-          <w:rFonts w:ascii="Calibri" w:cs="Calibri" w:eastAsia="Calibri" w:hAnsi="Calibri"/>
-        </w:rPr>
-        <w:t xml:space="preserve">) can collapse a same-table </w:t>
-      </w:r>
-      <w:r>
-        <w:rPr>
-          <w:rFonts w:ascii="Consolas" w:cs="Consolas" w:eastAsia="Consolas" w:hAnsi="Consolas"/>
-          <w:sz w:val="20"/>
-          <w:szCs w:val="20"/>
-          <w:shd w:fill="F0F0F0"/>
-        </w:rPr>
-        <w:t xml:space="preserve">CALCULATE</w:t>
-      </w:r>
-      <w:r>
-        <w:rPr>
-          <w:rFonts w:ascii="Calibri" w:cs="Calibri" w:eastAsia="Calibri" w:hAnsi="Calibri"/>
-        </w:rPr>
-        <w:t xml:space="preserve"> filter that matches zero rows into </w:t>
-      </w:r>
-      <w:r>
-        <w:rPr>
-          <w:rFonts w:ascii="Consolas" w:cs="Consolas" w:eastAsia="Consolas" w:hAnsi="Consolas"/>
-          <w:sz w:val="20"/>
-          <w:szCs w:val="20"/>
-          <w:shd w:fill="F0F0F0"/>
-        </w:rPr>
-        <w:t xml:space="preserve">BLANK()</w:t>
-      </w:r>
-      <w:r>
-        <w:rPr>
-          <w:rFonts w:ascii="Calibri" w:cs="Calibri" w:eastAsia="Calibri" w:hAnsi="Calibri"/>
-        </w:rPr>
-        <w:t xml:space="preserve"> rather than a literal </w:t>
-      </w:r>
-      <w:r>
-        <w:rPr>
-          <w:rFonts w:ascii="Consolas" w:cs="Consolas" w:eastAsia="Consolas" w:hAnsi="Consolas"/>
-          <w:sz w:val="20"/>
-          <w:szCs w:val="20"/>
-          <w:shd w:fill="F0F0F0"/>
-        </w:rPr>
-        <w:t xml:space="preserve">0</w:t>
-      </w:r>
-      <w:r>
-        <w:rPr>
-          <w:rFonts w:ascii="Calibri" w:cs="Calibri" w:eastAsia="Calibri" w:hAnsi="Calibri"/>
-        </w:rPr>
-        <w:t xml:space="preserve">. Fix: append </w:t>
-      </w:r>
-      <w:r>
-        <w:rPr>
-          <w:rFonts w:ascii="Consolas" w:cs="Consolas" w:eastAsia="Consolas" w:hAnsi="Consolas"/>
-          <w:sz w:val="20"/>
-          <w:szCs w:val="20"/>
-          <w:shd w:fill="F0F0F0"/>
-        </w:rPr>
-        <w:t xml:space="preserve">+ 0</w:t>
-      </w:r>
-      <w:r>
-        <w:rPr>
-          <w:rFonts w:ascii="Calibri" w:cs="Calibri" w:eastAsia="Calibri" w:hAnsi="Calibri"/>
-        </w:rPr>
-        <w:t xml:space="preserve"> to the end of the </w:t>
-      </w:r>
-      <w:r>
-        <w:rPr>
-          <w:rFonts w:ascii="Consolas" w:cs="Consolas" w:eastAsia="Consolas" w:hAnsi="Consolas"/>
-          <w:sz w:val="20"/>
-          <w:szCs w:val="20"/>
-          <w:shd w:fill="F0F0F0"/>
-        </w:rPr>
-        <w:t xml:space="preserve">DIVIDE(...)</w:t>
-      </w:r>
-      <w:r>
-        <w:rPr>
-          <w:rFonts w:ascii="Calibri" w:cs="Calibri" w:eastAsia="Calibri" w:hAnsi="Calibri"/>
-        </w:rPr>
-        <w:t xml:space="preserve">, which coerces any blank result back to a real zero. See </w:t>
-      </w:r>
-      <w:r>
-        <w:rPr>
-          <w:rFonts w:ascii="Consolas" w:cs="Consolas" w:eastAsia="Consolas" w:hAnsi="Consolas"/>
-          <w:sz w:val="20"/>
-          <w:szCs w:val="20"/>
-          <w:shd w:fill="F0F0F0"/>
+        <w:t xml:space="preserve"> bugs before it: by checking that a number which should exist (0%, not "no data") actually rendered instead of assuming a clean-looking chart was correct. See </w:t>
+      </w:r>
+      <w:r>
+        <w:rPr>
+          <w:rFonts w:ascii="Consolas" w:cs="Consolas" w:eastAsia="Consolas" w:hAnsi="Consolas"/>
+          <w:sz w:val="20"/>
+          <w:szCs w:val="20"/>
+          <w:shd w:fill="F0F0F0" w:val="clear"/>
         </w:rPr>
         <w:t xml:space="preserve">fact_table_data_dictionary.md</w:t>
       </w:r>
@@ -2552,13 +2857,13 @@
           <w:b/>
           <w:bCs/>
         </w:rPr>
-        <w:t xml:space="preserve">Caveats to carry onto the page: </w:t>
-      </w:r>
-      <w:r>
-        <w:rPr>
-          <w:rFonts w:ascii="Calibri" w:cs="Calibri" w:eastAsia="Calibri" w:hAnsi="Calibri"/>
-        </w:rPr>
-        <w:t xml:space="preserve">none beyond what's already built in — this page's entire content is caveats. Worth remembering: the page documents known limitations, but it can't catch limitations nobody's found yet. Treat it as the floor of what's uncertain about this dataset, not the ceiling.</w:t>
+        <w:t xml:space="preserve">Caveats to carry onto the page:</w:t>
+      </w:r>
+      <w:r>
+        <w:rPr>
+          <w:rFonts w:ascii="Calibri" w:cs="Calibri" w:eastAsia="Calibri" w:hAnsi="Calibri"/>
+        </w:rPr>
+        <w:t xml:space="preserve"> none beyond what's already built in — this page's entire content *is* caveats. Worth remembering, though: the page documents known limitations, but it can't catch limitations nobody's found yet. Treat it as the floor of what's uncertain about this dataset, not the ceiling.</w:t>
       </w:r>
     </w:p>
     <w:sectPr>
@@ -2571,10 +2876,6 @@
 </w:document>
 </file>
 
-<file path=word/comments.xml><?xml version="1.0" encoding="utf-8"?>
-<w:comments xmlns:cx="http://schemas.microsoft.com/office/drawing/2014/chartex" xmlns:cx1="http://schemas.microsoft.com/office/drawing/2015/9/8/chartex" xmlns:cx2="http://schemas.microsoft.com/office/drawing/2015/10/21/chartex" xmlns:cx3="http://schemas.microsoft.com/office/drawing/2016/5/9/chartex" xmlns:cx4="http://schemas.microsoft.com/office/drawing/2016/5/10/chartex" xmlns:cx5="http://schemas.microsoft.com/office/drawing/2016/5/11/chartex" xmlns:cx6="http://schemas.microsoft.com/office/drawing/2016/5/12/chartex" xmlns:cx7="http://schemas.microsoft.com/office/drawing/2016/5/13/chartex" xmlns:cx8="http://schemas.microsoft.com/office/drawing/2016/5/14/chartex" xmlns:mc="http://schemas.openxmlformats.org/markup-compatibility/2006" xmlns:aink="http://schemas.microsoft.com/office/drawing/2016/ink" xmlns:am3d="http://schemas.microsoft.com/office/drawing/2017/model3d" xmlns:o="urn:schemas-microsoft-com:office:office" xmlns:r="http://schemas.openxmlformats.org/officeDocument/2006/relationships" xmlns:m="http://schemas.openxmlformats.org/officeDocument/2006/math" xmlns:v="urn:schemas-microsoft-com:vml" xmlns:wp14="http://schemas.microsoft.com/office/word/2010/wordprocessingDrawing" xmlns:wp="http://schemas.openxmlformats.org/drawingml/2006/wordprocessingDrawing" xmlns:w10="urn:schemas-microsoft-com:office:word" xmlns:w="http://schemas.openxmlformats.org/wordprocessingml/2006/main" xmlns:w14="http://schemas.microsoft.com/office/word/2010/wordml" xmlns:w15="http://schemas.microsoft.com/office/word/2012/wordml" xmlns:w16cex="http://schemas.microsoft.com/office/word/2018/wordml/cex" xmlns:w16cid="http://schemas.microsoft.com/office/word/2016/wordml/cid" xmlns:w16="http://schemas.microsoft.com/office/word/2018/wordml" xmlns:w16sdtdh="http://schemas.microsoft.com/office/word/2020/wordml/sdtdatahash" xmlns:w16se="http://schemas.microsoft.com/office/word/2015/wordml/symex" xmlns:wpg="http://schemas.microsoft.com/office/word/2010/wordprocessingGroup" xmlns:wpi="http://schemas.microsoft.com/office/word/2010/wordprocessingInk" xmlns:wne="http://schemas.microsoft.com/office/word/2006/wordml" xmlns:wps="http://schemas.microsoft.com/office/word/2010/wordprocessingShape"/>
-</file>
-
 <file path=word/endnotes.xml><?xml version="1.0" encoding="utf-8"?>
 <w:endnotes xmlns:wpc="http://schemas.microsoft.com/office/word/2010/wordprocessingCanvas" xmlns:mc="http://schemas.openxmlformats.org/markup-compatibility/2006" xmlns:o="urn:schemas-microsoft-com:office:office" xmlns:r="http://schemas.openxmlformats.org/officeDocument/2006/relationships" xmlns:m="http://schemas.openxmlformats.org/officeDocument/2006/math" xmlns:v="urn:schemas-microsoft-com:vml" xmlns:wp14="http://schemas.microsoft.com/office/word/2010/wordprocessingDrawing" xmlns:wp="http://schemas.openxmlformats.org/drawingml/2006/wordprocessingDrawing" xmlns:w10="urn:schemas-microsoft-com:office:word" xmlns:w="http://schemas.openxmlformats.org/wordprocessingml/2006/main" xmlns:w14="http://schemas.microsoft.com/office/word/2010/wordml" xmlns:w15="http://schemas.microsoft.com/office/word/2012/wordml" xmlns:wpg="http://schemas.microsoft.com/office/word/2010/wordprocessingGroup" xmlns:wpi="http://schemas.microsoft.com/office/word/2010/wordprocessingInk" xmlns:wne="http://schemas.microsoft.com/office/word/2006/wordml" xmlns:wps="http://schemas.microsoft.com/office/word/2010/wordprocessingShape" mc:Ignorable="w14 w15 wp14">
   <w:endnote w:type="separator" w:id="-1">
@@ -2653,7 +2954,7 @@
 <w:numbering xmlns:wpc="http://schemas.microsoft.com/office/word/2010/wordprocessingCanvas" xmlns:mc="http://schemas.openxmlformats.org/markup-compatibility/2006" xmlns:o="urn:schemas-microsoft-com:office:office" xmlns:r="http://schemas.openxmlformats.org/officeDocument/2006/relationships" xmlns:m="http://schemas.openxmlformats.org/officeDocument/2006/math" xmlns:v="urn:schemas-microsoft-com:vml" xmlns:wp14="http://schemas.microsoft.com/office/word/2010/wordprocessingDrawing" xmlns:wp="http://schemas.openxmlformats.org/drawingml/2006/wordprocessingDrawing" xmlns:w10="urn:schemas-microsoft-com:office:word" xmlns:w="http://schemas.openxmlformats.org/wordprocessingml/2006/main" xmlns:w14="http://schemas.microsoft.com/office/word/2010/wordml" xmlns:w15="http://schemas.microsoft.com/office/word/2012/wordml" xmlns:wpg="http://schemas.microsoft.com/office/word/2010/wordprocessingGroup" xmlns:wpi="http://schemas.microsoft.com/office/word/2010/wordprocessingInk" xmlns:wne="http://schemas.microsoft.com/office/word/2006/wordml" xmlns:wps="http://schemas.microsoft.com/office/word/2010/wordprocessingShape" mc:Ignorable="w14 w15 wp14">
   <w:abstractNum w:abstractNumId="1" w15:restartNumberingAfterBreak="0">
     <w:multiLevelType w:val="hybridMultilevel"/>
-    <w:lvl w:ilvl="0" w15:tentative="1">
+    <w:lvl w:ilvl="0" w:tentative="1">
       <w:start w:val="1"/>
       <w:numFmt w:val="bullet"/>
       <w:lvlText w:val="●"/>
@@ -2662,7 +2963,7 @@
         <w:ind w:left="720" w:hanging="360"/>
       </w:pPr>
     </w:lvl>
-    <w:lvl w:ilvl="1" w15:tentative="1">
+    <w:lvl w:ilvl="1" w:tentative="1">
       <w:start w:val="1"/>
       <w:numFmt w:val="bullet"/>
       <w:lvlText w:val="○"/>
@@ -2671,7 +2972,7 @@
         <w:ind w:left="1440" w:hanging="360"/>
       </w:pPr>
     </w:lvl>
-    <w:lvl w:ilvl="2" w15:tentative="1">
+    <w:lvl w:ilvl="2" w:tentative="1">
       <w:start w:val="1"/>
       <w:numFmt w:val="bullet"/>
       <w:lvlText w:val="■"/>
@@ -2680,7 +2981,7 @@
         <w:ind w:left="2160" w:hanging="360"/>
       </w:pPr>
     </w:lvl>
-    <w:lvl w:ilvl="3" w15:tentative="1">
+    <w:lvl w:ilvl="3" w:tentative="1">
       <w:start w:val="1"/>
       <w:numFmt w:val="bullet"/>
       <w:lvlText w:val="●"/>
@@ -2689,7 +2990,7 @@
         <w:ind w:left="2880" w:hanging="360"/>
       </w:pPr>
     </w:lvl>
-    <w:lvl w:ilvl="4" w15:tentative="1">
+    <w:lvl w:ilvl="4" w:tentative="1">
       <w:start w:val="1"/>
       <w:numFmt w:val="bullet"/>
       <w:lvlText w:val="○"/>
@@ -2698,7 +2999,7 @@
         <w:ind w:left="3600" w:hanging="360"/>
       </w:pPr>
     </w:lvl>
-    <w:lvl w:ilvl="5" w15:tentative="1">
+    <w:lvl w:ilvl="5" w:tentative="1">
       <w:start w:val="1"/>
       <w:numFmt w:val="bullet"/>
       <w:lvlText w:val="■"/>
@@ -2707,7 +3008,7 @@
         <w:ind w:left="4320" w:hanging="360"/>
       </w:pPr>
     </w:lvl>
-    <w:lvl w:ilvl="6" w15:tentative="1">
+    <w:lvl w:ilvl="6" w:tentative="1">
       <w:start w:val="1"/>
       <w:numFmt w:val="bullet"/>
       <w:lvlText w:val="●"/>
@@ -2716,7 +3017,7 @@
         <w:ind w:left="5040" w:hanging="360"/>
       </w:pPr>
     </w:lvl>
-    <w:lvl w:ilvl="7" w15:tentative="1">
+    <w:lvl w:ilvl="7" w:tentative="1">
       <w:start w:val="1"/>
       <w:numFmt w:val="bullet"/>
       <w:lvlText w:val="●"/>
@@ -2725,7 +3026,7 @@
         <w:ind w:left="5760" w:hanging="360"/>
       </w:pPr>
     </w:lvl>
-    <w:lvl w:ilvl="8" w15:tentative="1">
+    <w:lvl w:ilvl="8" w:tentative="1">
       <w:start w:val="1"/>
       <w:numFmt w:val="bullet"/>
       <w:lvlText w:val="●"/>
@@ -2737,18 +3038,42 @@
   </w:abstractNum>
   <w:abstractNum w:abstractNumId="2" w15:restartNumberingAfterBreak="0">
     <w:multiLevelType w:val="hybridMultilevel"/>
-    <w:lvl w:ilvl="0" w15:tentative="1">
+    <w:lvl w:ilvl="0" w:tentative="1">
       <w:start w:val="1"/>
-      <w:numFmt w:val="bullet"/>
-      <w:lvlText w:val="•"/>
+      <w:numFmt w:val="decimal"/>
+      <w:lvlText w:val="%1."/>
       <w:lvlJc w:val="left"/>
       <w:pPr>
-        <w:ind w:left="480" w:hanging="260"/>
+        <w:ind w:left="504" w:hanging="360"/>
+      </w:pPr>
+    </w:lvl>
+  </w:abstractNum>
+  <w:abstractNum w:abstractNumId="3" w15:restartNumberingAfterBreak="0">
+    <w:multiLevelType w:val="hybridMultilevel"/>
+    <w:lvl w:ilvl="0" w:tentative="1">
+      <w:start w:val="1"/>
+      <w:numFmt w:val="decimal"/>
+      <w:lvlText w:val="%1."/>
+      <w:lvlJc w:val="left"/>
+      <w:pPr>
+        <w:ind w:left="504" w:hanging="360"/>
       </w:pPr>
     </w:lvl>
   </w:abstractNum>
   <w:num w:numId="1">
     <w:abstractNumId w:val="1"/>
+    <w:lvlOverride w:ilvl="0">
+      <w:startOverride w:val="1"/>
+    </w:lvlOverride>
+  </w:num>
+  <w:num w:numId="2">
+    <w:abstractNumId w:val="2"/>
+    <w:lvlOverride w:ilvl="0">
+      <w:startOverride w:val="1"/>
+    </w:lvlOverride>
+  </w:num>
+  <w:num w:numId="3">
+    <w:abstractNumId w:val="3"/>
     <w:lvlOverride w:ilvl="0">
       <w:startOverride w:val="1"/>
     </w:lvlOverride>
@@ -2762,6 +3087,25 @@
     <w:rPrDefault/>
     <w:pPrDefault/>
   </w:docDefaults>
+  <w:style w:type="paragraph" w:styleId="Normal" w:default="1">
+    <w:name w:val="Normal"/>
+    <w:qFormat/>
+  </w:style>
+  <w:style w:type="table" w:styleId="TableNormal" w:default="true">
+    <w:name w:val="Normal Table"/>
+    <w:uiPriority w:val="99"/>
+    <w:semiHidden/>
+    <w:unhideWhenUsed/>
+    <w:tblPr>
+      <w:tblInd w:type="dxa" w:w="0"/>
+      <w:tblCellMar>
+        <w:top w:type="dxa" w:w="0"/>
+        <w:left w:type="dxa" w:w="108"/>
+        <w:bottom w:type="dxa" w:w="0"/>
+        <w:right w:type="dxa" w:w="108"/>
+      </w:tblCellMar>
+    </w:tblPr>
+  </w:style>
   <w:style w:type="paragraph" w:styleId="Title">
     <w:name w:val="Title"/>
     <w:basedOn w:val="Normal"/>
@@ -2849,6 +3193,139 @@
     <w:basedOn w:val="Normal"/>
     <w:qFormat/>
   </w:style>
+  <w:style w:type="paragraph" w:styleId="Caption">
+    <w:name w:val="caption"/>
+    <w:basedOn w:val="Normal"/>
+    <w:next w:val="Normal"/>
+    <w:uiPriority w:val="35"/>
+    <w:semiHidden/>
+    <w:unhideWhenUsed/>
+    <w:qFormat/>
+    <w:pPr>
+      <w:spacing w:after="200"/>
+    </w:pPr>
+    <w:rPr>
+      <w:i/>
+      <w:iCs/>
+      <w:color w:val="44546A" w:themeColor="dark2"/>
+      <w:sz w:val="18"/>
+      <w:szCs w:val="18"/>
+    </w:rPr>
+  </w:style>
+  <w:style w:type="paragraph" w:styleId="Bibliography">
+    <w:name w:val="Bibliography"/>
+    <w:basedOn w:val="Normal"/>
+    <w:next w:val="Normal"/>
+    <w:uiPriority w:val="37"/>
+    <w:unhideWhenUsed/>
+  </w:style>
+  <w:style w:type="paragraph" w:styleId="TOC1">
+    <w:name w:val="toc 1"/>
+    <w:basedOn w:val="Normal"/>
+    <w:next w:val="Normal"/>
+    <w:uiPriority w:val="39"/>
+    <w:semiHidden/>
+    <w:unhideWhenUsed/>
+    <w:pPr>
+      <w:spacing w:after="100"/>
+    </w:pPr>
+  </w:style>
+  <w:style w:type="paragraph" w:styleId="TOC2">
+    <w:name w:val="toc 2"/>
+    <w:basedOn w:val="Normal"/>
+    <w:next w:val="Normal"/>
+    <w:uiPriority w:val="39"/>
+    <w:semiHidden/>
+    <w:unhideWhenUsed/>
+    <w:pPr>
+      <w:spacing w:after="100"/>
+      <w:ind w:left="200"/>
+    </w:pPr>
+  </w:style>
+  <w:style w:type="paragraph" w:styleId="TOC3">
+    <w:name w:val="toc 3"/>
+    <w:basedOn w:val="Normal"/>
+    <w:next w:val="Normal"/>
+    <w:uiPriority w:val="39"/>
+    <w:semiHidden/>
+    <w:unhideWhenUsed/>
+    <w:pPr>
+      <w:spacing w:after="100"/>
+      <w:ind w:left="400"/>
+    </w:pPr>
+  </w:style>
+  <w:style w:type="paragraph" w:styleId="TOC4">
+    <w:name w:val="toc 4"/>
+    <w:basedOn w:val="Normal"/>
+    <w:next w:val="Normal"/>
+    <w:uiPriority w:val="39"/>
+    <w:semiHidden/>
+    <w:unhideWhenUsed/>
+    <w:pPr>
+      <w:spacing w:after="100"/>
+      <w:ind w:left="600"/>
+    </w:pPr>
+  </w:style>
+  <w:style w:type="paragraph" w:styleId="TOC5">
+    <w:name w:val="toc 5"/>
+    <w:basedOn w:val="Normal"/>
+    <w:next w:val="Normal"/>
+    <w:uiPriority w:val="39"/>
+    <w:semiHidden/>
+    <w:unhideWhenUsed/>
+    <w:pPr>
+      <w:spacing w:after="100"/>
+      <w:ind w:left="800"/>
+    </w:pPr>
+  </w:style>
+  <w:style w:type="paragraph" w:styleId="TOC6">
+    <w:name w:val="toc 6"/>
+    <w:basedOn w:val="Normal"/>
+    <w:next w:val="Normal"/>
+    <w:uiPriority w:val="39"/>
+    <w:semiHidden/>
+    <w:unhideWhenUsed/>
+    <w:pPr>
+      <w:spacing w:after="100"/>
+      <w:ind w:left="1000"/>
+    </w:pPr>
+  </w:style>
+  <w:style w:type="paragraph" w:styleId="TOC7">
+    <w:name w:val="toc 7"/>
+    <w:basedOn w:val="Normal"/>
+    <w:next w:val="Normal"/>
+    <w:uiPriority w:val="39"/>
+    <w:semiHidden/>
+    <w:unhideWhenUsed/>
+    <w:pPr>
+      <w:spacing w:after="100"/>
+      <w:ind w:left="1200"/>
+    </w:pPr>
+  </w:style>
+  <w:style w:type="paragraph" w:styleId="TOC8">
+    <w:name w:val="toc 8"/>
+    <w:basedOn w:val="Normal"/>
+    <w:next w:val="Normal"/>
+    <w:uiPriority w:val="39"/>
+    <w:semiHidden/>
+    <w:unhideWhenUsed/>
+    <w:pPr>
+      <w:spacing w:after="100"/>
+      <w:ind w:left="1400"/>
+    </w:pPr>
+  </w:style>
+  <w:style w:type="paragraph" w:styleId="TOC9">
+    <w:name w:val="toc 9"/>
+    <w:basedOn w:val="Normal"/>
+    <w:next w:val="Normal"/>
+    <w:uiPriority w:val="39"/>
+    <w:semiHidden/>
+    <w:unhideWhenUsed/>
+    <w:pPr>
+      <w:spacing w:after="100"/>
+      <w:ind w:left="1600"/>
+    </w:pPr>
+  </w:style>
   <w:style w:type="character" w:styleId="Hyperlink">
     <w:name w:val="Hyperlink"/>
     <w:basedOn w:val="DefaultParagraphFont"/>
@@ -2933,5 +3410,302 @@
       <w:szCs w:val="20"/>
     </w:rPr>
   </w:style>
+  <w:style w:type="character" w:styleId="LineNumber">
+    <w:name w:val="line number"/>
+    <w:basedOn w:val="DefaultParagraphFont"/>
+    <w:uiPriority w:val="99"/>
+    <w:semiHidden/>
+    <w:unhideWhenUsed/>
+  </w:style>
 </w:styles>
+</file>
+
+<file path=word/theme/theme1.xml><?xml version="1.0" encoding="utf-8"?>
+<a:theme xmlns:a="http://schemas.openxmlformats.org/drawingml/2006/main" name="Office Theme">
+  <a:themeElements>
+    <a:clrScheme name="Office">
+      <a:dk1>
+        <a:sysClr val="windowText" lastClr="000000"/>
+      </a:dk1>
+      <a:lt1>
+        <a:sysClr val="window" lastClr="FFFFFF"/>
+      </a:lt1>
+      <a:dk2>
+        <a:srgbClr val="44546A"/>
+      </a:dk2>
+      <a:lt2>
+        <a:srgbClr val="E7E6E6"/>
+      </a:lt2>
+      <a:accent1>
+        <a:srgbClr val="4472C4"/>
+      </a:accent1>
+      <a:accent2>
+        <a:srgbClr val="ED7D31"/>
+      </a:accent2>
+      <a:accent3>
+        <a:srgbClr val="A5A5A5"/>
+      </a:accent3>
+      <a:accent4>
+        <a:srgbClr val="FFC000"/>
+      </a:accent4>
+      <a:accent5>
+        <a:srgbClr val="5B9BD5"/>
+      </a:accent5>
+      <a:accent6>
+        <a:srgbClr val="70AD47"/>
+      </a:accent6>
+      <a:hlink>
+        <a:srgbClr val="0563C1"/>
+      </a:hlink>
+      <a:folHlink>
+        <a:srgbClr val="954F72"/>
+      </a:folHlink>
+    </a:clrScheme>
+    <a:fontScheme name="Office">
+      <a:majorFont>
+        <a:latin typeface="Calibri Light" panose="020F0302020204030204"/>
+        <a:ea typeface=""/>
+        <a:cs typeface=""/>
+        <a:font script="Jpan" typeface="游ゴシック Light"/>
+        <a:font script="Hang" typeface="맑은 고딕"/>
+        <a:font script="Hans" typeface="等线 Light"/>
+        <a:font script="Hant" typeface="新細明體"/>
+        <a:font script="Arab" typeface="Times New Roman"/>
+        <a:font script="Hebr" typeface="Times New Roman"/>
+        <a:font script="Thai" typeface="Angsana New"/>
+        <a:font script="Ethi" typeface="Nyala"/>
+        <a:font script="Beng" typeface="Vrinda"/>
+        <a:font script="Gujr" typeface="Shruti"/>
+        <a:font script="Khmr" typeface="MoolBoran"/>
+        <a:font script="Knda" typeface="Tunga"/>
+        <a:font script="Guru" typeface="Raavi"/>
+        <a:font script="Cans" typeface="Euphemia"/>
+        <a:font script="Cher" typeface="Plantagenet Cherokee"/>
+        <a:font script="Yiii" typeface="Microsoft Yi Baiti"/>
+        <a:font script="Tibt" typeface="Microsoft Himalaya"/>
+        <a:font script="Thaa" typeface="MV Boli"/>
+        <a:font script="Deva" typeface="Mangal"/>
+        <a:font script="Telu" typeface="Gautami"/>
+        <a:font script="Taml" typeface="Latha"/>
+        <a:font script="Syrc" typeface="Estrangelo Edessa"/>
+        <a:font script="Orya" typeface="Kalinga"/>
+        <a:font script="Mlym" typeface="Kartika"/>
+        <a:font script="Laoo" typeface="DokChampa"/>
+        <a:font script="Sinh" typeface="Iskoola Pota"/>
+        <a:font script="Mong" typeface="Mongolian Baiti"/>
+        <a:font script="Viet" typeface="Times New Roman"/>
+        <a:font script="Uigh" typeface="Microsoft Uighur"/>
+        <a:font script="Geor" typeface="Sylfaen"/>
+        <a:font script="Armn" typeface="Arial"/>
+        <a:font script="Bugi" typeface="Leelawadee UI"/>
+        <a:font script="Bopo" typeface="Microsoft JhengHei"/>
+        <a:font script="Java" typeface="Javanese Text"/>
+        <a:font script="Lisu" typeface="Segoe UI"/>
+        <a:font script="Mymr" typeface="Myanmar Text"/>
+        <a:font script="Nkoo" typeface="Ebrima"/>
+        <a:font script="Olck" typeface="Nirmala UI"/>
+        <a:font script="Osma" typeface="Ebrima"/>
+        <a:font script="Phag" typeface="Phagspa"/>
+        <a:font script="Syrn" typeface="Estrangelo Edessa"/>
+        <a:font script="Syrj" typeface="Estrangelo Edessa"/>
+        <a:font script="Syre" typeface="Estrangelo Edessa"/>
+        <a:font script="Sora" typeface="Nirmala UI"/>
+        <a:font script="Tale" typeface="Microsoft Tai Le"/>
+        <a:font script="Talu" typeface="Microsoft New Tai Lue"/>
+        <a:font script="Tfng" typeface="Ebrima"/>
+      </a:majorFont>
+      <a:minorFont>
+        <a:latin typeface="Calibri" panose="020F0502020204030204"/>
+        <a:ea typeface=""/>
+        <a:cs typeface=""/>
+        <a:font script="Jpan" typeface="游明朝"/>
+        <a:font script="Hang" typeface="맑은 고딕"/>
+        <a:font script="Hans" typeface="等线"/>
+        <a:font script="Hant" typeface="新細明體"/>
+        <a:font script="Arab" typeface="Arial"/>
+        <a:font script="Hebr" typeface="Arial"/>
+        <a:font script="Thai" typeface="Cordia New"/>
+        <a:font script="Ethi" typeface="Nyala"/>
+        <a:font script="Beng" typeface="Vrinda"/>
+        <a:font script="Gujr" typeface="Shruti"/>
+        <a:font script="Khmr" typeface="DaunPenh"/>
+        <a:font script="Knda" typeface="Tunga"/>
+        <a:font script="Guru" typeface="Raavi"/>
+        <a:font script="Cans" typeface="Euphemia"/>
+        <a:font script="Cher" typeface="Plantagenet Cherokee"/>
+        <a:font script="Yiii" typeface="Microsoft Yi Baiti"/>
+        <a:font script="Tibt" typeface="Microsoft Himalaya"/>
+        <a:font script="Thaa" typeface="MV Boli"/>
+        <a:font script="Deva" typeface="Mangal"/>
+        <a:font script="Telu" typeface="Gautami"/>
+        <a:font script="Taml" typeface="Latha"/>
+        <a:font script="Syrc" typeface="Estrangelo Edessa"/>
+        <a:font script="Orya" typeface="Kalinga"/>
+        <a:font script="Mlym" typeface="Kartika"/>
+        <a:font script="Laoo" typeface="DokChampa"/>
+        <a:font script="Sinh" typeface="Iskoola Pota"/>
+        <a:font script="Mong" typeface="Mongolian Baiti"/>
+        <a:font script="Viet" typeface="Arial"/>
+        <a:font script="Uigh" typeface="Microsoft Uighur"/>
+        <a:font script="Geor" typeface="Sylfaen"/>
+        <a:font script="Armn" typeface="Arial"/>
+        <a:font script="Bugi" typeface="Leelawadee UI"/>
+        <a:font script="Bopo" typeface="Microsoft JhengHei"/>
+        <a:font script="Java" typeface="Javanese Text"/>
+        <a:font script="Lisu" typeface="Segoe UI"/>
+        <a:font script="Mymr" typeface="Myanmar Text"/>
+        <a:font script="Nkoo" typeface="Ebrima"/>
+        <a:font script="Olck" typeface="Nirmala UI"/>
+        <a:font script="Osma" typeface="Ebrima"/>
+        <a:font script="Phag" typeface="Phagspa"/>
+        <a:font script="Syrn" typeface="Estrangelo Edessa"/>
+        <a:font script="Syrj" typeface="Estrangelo Edessa"/>
+        <a:font script="Syre" typeface="Estrangelo Edessa"/>
+        <a:font script="Sora" typeface="Nirmala UI"/>
+        <a:font script="Tale" typeface="Microsoft Tai Le"/>
+        <a:font script="Talu" typeface="Microsoft New Tai Lue"/>
+        <a:font script="Tfng" typeface="Ebrima"/>
+      </a:minorFont>
+    </a:fontScheme>
+    <a:fmtScheme name="Office">
+      <a:fillStyleLst>
+        <a:solidFill>
+          <a:schemeClr val="phClr"/>
+        </a:solidFill>
+        <a:gradFill rotWithShape="true">
+          <a:gsLst>
+            <a:gs pos="0">
+              <a:schemeClr val="phClr">
+                <a:lumMod val="110000"/>
+                <a:satMod val="105000"/>
+                <a:tint val="67000"/>
+              </a:schemeClr>
+            </a:gs>
+            <a:gs pos="50000">
+              <a:schemeClr val="phClr">
+                <a:lumMod val="105000"/>
+                <a:satMod val="103000"/>
+                <a:tint val="73000"/>
+              </a:schemeClr>
+            </a:gs>
+            <a:gs pos="100000">
+              <a:schemeClr val="phClr">
+                <a:lumMod val="105000"/>
+                <a:satMod val="109000"/>
+                <a:tint val="81000"/>
+              </a:schemeClr>
+            </a:gs>
+          </a:gsLst>
+          <a:lin ang="5400000" scaled="false"/>
+        </a:gradFill>
+        <a:gradFill rotWithShape="true">
+          <a:gsLst>
+            <a:gs pos="0">
+              <a:schemeClr val="phClr">
+                <a:satMod val="103000"/>
+                <a:lumMod val="102000"/>
+                <a:tint val="94000"/>
+              </a:schemeClr>
+            </a:gs>
+            <a:gs pos="50000">
+              <a:schemeClr val="phClr">
+                <a:satMod val="110000"/>
+                <a:lumMod val="100000"/>
+                <a:shade val="100000"/>
+              </a:schemeClr>
+            </a:gs>
+            <a:gs pos="100000">
+              <a:schemeClr val="phClr">
+                <a:lumMod val="99000"/>
+                <a:satMod val="120000"/>
+                <a:shade val="78000"/>
+              </a:schemeClr>
+            </a:gs>
+          </a:gsLst>
+          <a:lin ang="5400000" scaled="false"/>
+        </a:gradFill>
+      </a:fillStyleLst>
+      <a:lnStyleLst>
+        <a:ln w="6350" cap="flat" cmpd="sng" algn="ctr">
+          <a:solidFill>
+            <a:schemeClr val="phClr"/>
+          </a:solidFill>
+          <a:prstDash val="solid"/>
+          <a:miter lim="800000"/>
+        </a:ln>
+        <a:ln w="12700" cap="flat" cmpd="sng" algn="ctr">
+          <a:solidFill>
+            <a:schemeClr val="phClr"/>
+          </a:solidFill>
+          <a:prstDash val="solid"/>
+          <a:miter lim="800000"/>
+        </a:ln>
+        <a:ln w="19050" cap="flat" cmpd="sng" algn="ctr">
+          <a:solidFill>
+            <a:schemeClr val="phClr"/>
+          </a:solidFill>
+          <a:prstDash val="solid"/>
+          <a:miter lim="800000"/>
+        </a:ln>
+      </a:lnStyleLst>
+      <a:effectStyleLst>
+        <a:effectStyle>
+          <a:effectLst/>
+        </a:effectStyle>
+        <a:effectStyle>
+          <a:effectLst/>
+        </a:effectStyle>
+        <a:effectStyle>
+          <a:effectLst>
+            <a:outerShdw blurRad="57150" dist="19050" dir="5400000" algn="ctr" rotWithShape="false">
+              <a:srgbClr val="000000">
+                <a:alpha val="63000"/>
+              </a:srgbClr>
+            </a:outerShdw>
+          </a:effectLst>
+        </a:effectStyle>
+      </a:effectStyleLst>
+      <a:bgFillStyleLst>
+        <a:solidFill>
+          <a:schemeClr val="phClr"/>
+        </a:solidFill>
+        <a:solidFill>
+          <a:schemeClr val="phClr">
+            <a:tint val="95000"/>
+            <a:satMod val="170000"/>
+          </a:schemeClr>
+        </a:solidFill>
+        <a:gradFill rotWithShape="true">
+          <a:gsLst>
+            <a:gs pos="0">
+              <a:schemeClr val="phClr">
+                <a:tint val="93000"/>
+                <a:satMod val="150000"/>
+                <a:shade val="98000"/>
+                <a:lumMod val="102000"/>
+              </a:schemeClr>
+            </a:gs>
+            <a:gs pos="50000">
+              <a:schemeClr val="phClr">
+                <a:tint val="98000"/>
+                <a:satMod val="130000"/>
+                <a:shade val="90000"/>
+                <a:lumMod val="103000"/>
+              </a:schemeClr>
+            </a:gs>
+            <a:gs pos="100000">
+              <a:schemeClr val="phClr">
+                <a:shade val="63000"/>
+                <a:satMod val="120000"/>
+              </a:schemeClr>
+            </a:gs>
+          </a:gsLst>
+          <a:lin ang="5400000" scaled="false"/>
+        </a:gradFill>
+      </a:bgFillStyleLst>
+    </a:fmtScheme>
+  </a:themeElements>
+  <a:objectDefaults/>
+  <a:extraClrSchemeLst/>
+</a:theme>
 </file>
</xml_diff>